<commit_message>
docs(rapport): update Pencil mockups and TPI Word report
Co-Authored-By: Claude Opus 4.7 (1M context) <noreply@anthropic.com>
</commit_message>
<xml_diff>
--- a/docs/rapport-tpi/Documentation du TPI 2026.docx
+++ b/docs/rapport-tpi/Documentation du TPI 2026.docx
@@ -3769,13 +3769,7 @@
         <w:rPr>
           <w:lang w:val="fr-CH"/>
         </w:rPr>
-        <w:t>Le Centre d'Apprentissage TIC (CA TIC) de la HEIA-FR organise tout au long de l'année des stages de découverte du métier d'informaticien-ne CFC à destination des élèves du cycle d'orientation. Ces stages durent un à deux jours et permettent aux jeunes de réaliser plusieurs ateliers pratiques (programmation, montage PC, installation OS, impression 3D, etc.). Jusqu'à présent, le suivi administratif de ces sessions reposait sur des notes Microsoft OneNote saisies manuellement, sans structure relationnelle ni g</w:t>
-      </w:r>
-      <w:r>
-        <w:rPr>
-          <w:lang w:val="fr-CH"/>
-        </w:rPr>
-        <w:t>énération automatique des certificats de stage.</w:t>
+        <w:t>Le Centre d'Apprentissage TIC (CA TIC) de la HEIA-FR organise tout au long de l'année des stages de découverte du métier d'informaticien-ne CFC à destination des élèves du cycle d'orientation. Ces stages durent un à deux jours et permettent aux jeunes de réaliser plusieurs ateliers pratiques (programmation, montage PC, installation OS, impression 3D, etc.). Jusqu'à présent, le suivi administratif de ces sessions reposait sur des notes Microsoft OneNote saisies manuellement, sans structure relationnelle ni génération automatique des certificats de stage.</w:t>
       </w:r>
     </w:p>
     <w:p>
@@ -3937,6 +3931,7 @@
           <w:lang w:val="fr-CH"/>
         </w:rPr>
       </w:pPr>
+      <w:bookmarkStart w:id="2" w:name="_Toc229059083"/>
       <w:r>
         <w:rPr>
           <w:b/>
@@ -3955,7 +3950,31 @@
         <w:rPr>
           <w:lang w:val="fr-CH"/>
         </w:rPr>
-        <w:t>Toutes les fonctionnalités ont été implémentées et validées. L'application permet à l'équipe CA TIC de gérer l'ensemble du cycle de vie d'un stage depuis une seule interface :</w:t>
+        <w:t xml:space="preserve">Toutes les fonctionnalités ont été implémentées et validées. L'application permet à l'équipe CA TIC de gérer </w:t>
+      </w:r>
+      <w:r>
+        <w:rPr>
+          <w:lang w:val="fr-CH"/>
+        </w:rPr>
+        <w:t>les besoins</w:t>
+      </w:r>
+      <w:r>
+        <w:rPr>
+          <w:lang w:val="fr-CH"/>
+        </w:rPr>
+        <w:t xml:space="preserve"> </w:t>
+      </w:r>
+      <w:r>
+        <w:rPr>
+          <w:lang w:val="fr-CH"/>
+        </w:rPr>
+        <w:t>désirés pour</w:t>
+      </w:r>
+      <w:r>
+        <w:rPr>
+          <w:lang w:val="fr-CH"/>
+        </w:rPr>
+        <w:t xml:space="preserve"> d'un stage depuis une seule interface :</w:t>
       </w:r>
     </w:p>
     <w:p>
@@ -3975,7 +3994,19 @@
           <w:lang w:val="fr-CH"/>
         </w:rPr>
         <w:tab/>
-        <w:t>La création, la modification et la suppression des stagiaires sont fluides.</w:t>
+        <w:t xml:space="preserve">La création, la modification et la suppression des stagiaires sont </w:t>
+      </w:r>
+      <w:r>
+        <w:rPr>
+          <w:lang w:val="fr-CH"/>
+        </w:rPr>
+        <w:t>disponibles</w:t>
+      </w:r>
+      <w:r>
+        <w:rPr>
+          <w:lang w:val="fr-CH"/>
+        </w:rPr>
+        <w:t>.</w:t>
       </w:r>
     </w:p>
     <w:p>
@@ -4015,7 +4046,7 @@
           <w:lang w:val="fr-CH"/>
         </w:rPr>
         <w:tab/>
-        <w:t>Les certificats sont générés en quelques secondes au format PDF.</w:t>
+        <w:t>Les certificats sont générés au format PDF.</w:t>
       </w:r>
     </w:p>
     <w:p>
@@ -4035,32 +4066,73 @@
           <w:lang w:val="fr-CH"/>
         </w:rPr>
         <w:tab/>
-        <w:t>Les ateliers liés à un stage actif ne peuvent pas être supprimés.</w:t>
-      </w:r>
-    </w:p>
-    <w:p>
-      <w:pPr>
-        <w:rPr>
-          <w:lang w:val="fr-CH"/>
-        </w:rPr>
-      </w:pPr>
-      <w:r>
-        <w:rPr>
-          <w:lang w:val="fr-CH"/>
-        </w:rPr>
-        <w:t>La qualité du code est garantie par 25 scénarios Playwright (tests E2E sur navigateur réel) et une collection Postman complète exécutable via Newman. Le projet est livré avec un baseline de données reproductible (15 ateliers, 6 catégories, 26 stagiaires) versionné dans Git, ce qui permet de reproduire à tout moment l'état présenté lors de la passation.</w:t>
+        <w:t>Les ateliers liés à un stage</w:t>
+      </w:r>
+      <w:r>
+        <w:rPr>
+          <w:lang w:val="fr-CH"/>
+        </w:rPr>
+        <w:t xml:space="preserve"> ou les catégories liés à un atelier</w:t>
+      </w:r>
+      <w:r>
+        <w:rPr>
+          <w:lang w:val="fr-CH"/>
+        </w:rPr>
+        <w:t xml:space="preserve"> ne peuvent pas être supprimés.</w:t>
+      </w:r>
+    </w:p>
+    <w:p>
+      <w:pPr>
+        <w:rPr>
+          <w:lang w:val="fr-CH"/>
+        </w:rPr>
+      </w:pPr>
+      <w:r>
+        <w:rPr>
+          <w:lang w:val="fr-CH"/>
+        </w:rPr>
+        <w:t xml:space="preserve">La qualité du code est garantie par 25 scénarios </w:t>
+      </w:r>
+      <w:proofErr w:type="spellStart"/>
+      <w:r>
+        <w:rPr>
+          <w:lang w:val="fr-CH"/>
+        </w:rPr>
+        <w:t>Playwright</w:t>
+      </w:r>
+      <w:proofErr w:type="spellEnd"/>
+      <w:r>
+        <w:rPr>
+          <w:lang w:val="fr-CH"/>
+        </w:rPr>
+        <w:t xml:space="preserve"> (tests E2E sur navigateur réel) et une collection Postman complète exécutable via Newman. Le projet est livré avec un </w:t>
+      </w:r>
+      <w:proofErr w:type="spellStart"/>
+      <w:r>
+        <w:rPr>
+          <w:lang w:val="fr-CH"/>
+        </w:rPr>
+        <w:t>baseline</w:t>
+      </w:r>
+      <w:proofErr w:type="spellEnd"/>
+      <w:r>
+        <w:rPr>
+          <w:lang w:val="fr-CH"/>
+        </w:rPr>
+        <w:t xml:space="preserve"> de données reproductible (15 ateliers, 6 catégories, 26 stagiaires) versionné dans Git, ce qui permet de reproduire à tout moment l'état présenté lors de la passation.</w:t>
       </w:r>
     </w:p>
     <w:p>
       <w:pPr>
         <w:pStyle w:val="Titre1"/>
       </w:pPr>
-      <w:bookmarkStart w:id="2" w:name="_Toc229059083"/>
+      <w:proofErr w:type="spellStart"/>
       <w:r>
         <w:lastRenderedPageBreak/>
         <w:t>Préambule</w:t>
       </w:r>
       <w:bookmarkEnd w:id="2"/>
+      <w:proofErr w:type="spellEnd"/>
     </w:p>
     <w:p>
       <w:pPr>
@@ -4766,8 +4838,6 @@
       </w:r>
       <w:r>
         <w:tab/>
-      </w:r>
-      <w:r>
         <w:t>Docker</w:t>
       </w:r>
     </w:p>
@@ -4872,13 +4942,7 @@
         <w:rPr>
           <w:lang w:val="fr-CH"/>
         </w:rPr>
-        <w:t>Des outils d'intelligence artificielle (Claude Code) ont été utilisés pour améliorer la qualité rédactionnelle de ce rapport et accélérer certaines tâches répétitives de développement. Ils ont notamment servi à la correction orthographique, à la reformulation grammaticale, à la suggestion de refactoring de petits composants et à la génération de scaffolds de tests. Il ne s'agit en aucun cas d'un remplacement des compétences du candidat, mais d'un outil d'assistance visant à renforcer la qualité de la docume</w:t>
-      </w:r>
-      <w:r>
-        <w:rPr>
-          <w:lang w:val="fr-CH"/>
-        </w:rPr>
-        <w:t>ntation et du code.</w:t>
+        <w:t>Des outils d'intelligence artificielle (Claude Code) ont été utilisés pour améliorer la qualité rédactionnelle de ce rapport et accélérer certaines tâches répétitives de développement. Ils ont notamment servi à la correction orthographique, à la reformulation grammaticale, à la suggestion de refactoring de petits composants et à la génération de scaffolds de tests. Il ne s'agit en aucun cas d'un remplacement des compétences du candidat, mais d'un outil d'assistance visant à renforcer la qualité de la documentation et du code.</w:t>
       </w:r>
     </w:p>
     <w:p>
@@ -8256,11 +8320,6 @@
           <w:lang w:val="fr-CH"/>
         </w:rPr>
         <w:tab/>
-      </w:r>
-      <w:r>
-        <w:rPr>
-          <w:lang w:val="fr-CH"/>
-        </w:rPr>
         <w:t>Accès non autorisé : déploiement sur le réseau interne HEIA-FR uniquement. À moyen terme, intégration de la CA TIC Authentication Gateway (Microsoft MFA).</w:t>
       </w:r>
     </w:p>
@@ -9071,11 +9130,6 @@
           <w:lang w:val="fr-CH"/>
         </w:rPr>
         <w:tab/>
-      </w:r>
-      <w:r>
-        <w:rPr>
-          <w:lang w:val="fr-CH"/>
-        </w:rPr>
         <w:t>Frontend (Vue.js 3 + Vite, port 8081) : interface SPA, rendu côté client, appels API via Axios.</w:t>
       </w:r>
     </w:p>
@@ -9541,11 +9595,6 @@
           <w:lang w:val="fr-CH"/>
         </w:rPr>
         <w:tab/>
-      </w:r>
-      <w:r>
-        <w:rPr>
-          <w:lang w:val="fr-CH"/>
-        </w:rPr>
         <w:t>L'administrateur clique « Aperçu du certificat » sur une carte de stage.</w:t>
       </w:r>
     </w:p>
@@ -9607,11 +9656,6 @@
           <w:lang w:val="fr-CH"/>
         </w:rPr>
         <w:tab/>
-      </w:r>
-      <w:r>
-        <w:rPr>
-          <w:lang w:val="fr-CH"/>
-        </w:rPr>
         <w:t>Express récupère les données du stage et les ateliers associés depuis MariaDB.</w:t>
       </w:r>
     </w:p>
@@ -11019,95 +11063,131 @@
       <w:pPr>
         <w:pStyle w:val="Titre2"/>
       </w:pPr>
-      <w:bookmarkStart w:id="22" w:name="_Toc229059103"/>
       <w:r>
         <w:t>Stratégie de tests</w:t>
       </w:r>
-      <w:bookmarkEnd w:id="22"/>
-    </w:p>
-    <w:p>
-      <w:pPr/>
+    </w:p>
+    <w:p>
+      <w:pPr>
+        <w:rPr>
+          <w:lang w:val="fr-CH"/>
+        </w:rPr>
+      </w:pPr>
+      <w:r>
+        <w:rPr>
+          <w:lang w:val="fr-CH"/>
+        </w:rPr>
+        <w:t>Deux types de tests automatisés sont mis en place pour garantir la non-régression. Avant chaque exécution, la base est restaurée à un état connu via tests/setup/restore_db.sql et un sanity check vérifie l'intégrité du seed.</w:t>
+      </w:r>
+    </w:p>
+    <w:p>
+      <w:pPr>
+        <w:pStyle w:val="Titre3"/>
+      </w:pPr>
+      <w:r>
+        <w:t>Tests E2E — Playwright</w:t>
+      </w:r>
+    </w:p>
+    <w:p>
+      <w:pPr>
+        <w:rPr>
+          <w:lang w:val="fr-CH"/>
+        </w:rPr>
+      </w:pPr>
+      <w:r>
+        <w:rPr>
+          <w:lang w:val="fr-CH"/>
+        </w:rPr>
+        <w:t>Playwright pilote un vrai navigateur Chromium et exécute des scénarios utilisateurs complets. Le test simule les actions d'un humain : clics, saisies au clavier, navigation. La base de données est réinitialisée avant chaque exécution via tests/setup/restore_db.sql qui charge un seed reproductible (15 ateliers dont 13 visibles, 6 catégories, 26 stagiaires répartis sur avril/mai/juin 2026).</w:t>
+      </w:r>
+    </w:p>
+    <w:p>
+      <w:pPr>
+        <w:rPr>
+          <w:lang w:val="fr-CH"/>
+        </w:rPr>
+      </w:pPr>
+      <w:r>
+        <w:rPr>
+          <w:lang w:val="fr-CH"/>
+        </w:rPr>
+        <w:t>Les scénarios couvrent : navigation entre pages, CRUD stagiaire, validation des dates, badges de statut, recherche par nom, comportement en cas d'erreur réseau, tri et groupement par mois, état du formulaire (reset / pré-remplissage), navigation clavier, sécurité XSS dans les champs texte, valeurs limites (255 caractères), CRUD atelier, contrainte de suppression, association ateliers ↔ stages, CRUD catégorie + Cannot Delete Modal, navigation vers le certificat.</w:t>
+      </w:r>
+    </w:p>
+    <w:p>
+      <w:pPr>
+        <w:pStyle w:val="Titre3"/>
+      </w:pPr>
+      <w:r>
+        <w:lastRenderedPageBreak/>
+        <w:t>Tests fonctionnels API — Postman / Newman</w:t>
+      </w:r>
+    </w:p>
+    <w:p>
+      <w:pPr>
+        <w:rPr>
+          <w:lang w:val="fr-CH"/>
+        </w:rPr>
+      </w:pPr>
+      <w:r>
+        <w:rPr>
+          <w:lang w:val="fr-CH"/>
+        </w:rPr>
+        <w:t>La collection Postman valide le contrat d'interface de l'API REST. Chaque requête possède des assertions Postman qui vérifient le code HTTP, la structure JSON et les invariants attendus. La collection est exécutable en ligne de commande via Newman (npm run test:api), ce qui permet de l'intégrer à un pipeline CI.</w:t>
+      </w:r>
+    </w:p>
+    <w:p>
+      <w:pPr>
+        <w:rPr>
+          <w:lang w:val="fr-CH"/>
+        </w:rPr>
+      </w:pPr>
+      <w:r>
+        <w:rPr>
+          <w:lang w:val="fr-CH"/>
+        </w:rPr>
+        <w:t>La couverture inclut : CRUD complet sur les trois ressources principales, contraintes métier (HTTP 409 pour suppression bloquée, 422 pour validation), endpoints de document (upload/download/delete), et endpoint de génération du certificat.</w:t>
+      </w:r>
+    </w:p>
+    <w:p>
+      <w:pPr>
+        <w:pStyle w:val="Titre3"/>
+        <w:rPr>
+          <w:lang w:val="fr-CH"/>
+        </w:rPr>
+      </w:pPr>
+      <w:r>
+        <w:rPr>
+          <w:lang w:val="fr-CH"/>
+        </w:rPr>
+        <w:t>Sanity check d'intégrité de la base</w:t>
+      </w:r>
+    </w:p>
+    <w:p>
+      <w:pPr>
+        <w:rPr>
+          <w:lang w:val="fr-CH"/>
+        </w:rPr>
+      </w:pPr>
+      <w:r>
+        <w:rPr>
+          <w:lang w:val="fr-CH"/>
+        </w:rPr>
+        <w:t>Avant chaque suite de tests, un sanity check Playwright et un sanity check Postman vérifient que la restauration s'est correctement déroulée. Les deux suites valident les mêmes invariants : 26 stagiaires au total dans internship, 13 activités visibles renvoyées par GET /api/activities, 6 catégories par défaut. Un spot-check confirme que le stagiaire ID 60 est bien Joël Dacobeau et que le stagiaire ID 1 (Lucas Martin) a les activités 1 et 2 liées dans internship_activity. Si l'un de ces invariants n'est pas respecté, la suite s'arrête immédiatement — inutile de lancer les vrais tests sur des données partielles.</w:t>
+      </w:r>
+    </w:p>
+    <w:p>
+      <w:pPr>
+        <w:rPr>
+          <w:lang w:val="fr-CH"/>
+        </w:rPr>
+      </w:pPr>
       <w:bookmarkStart w:id="22" w:name="_Toc229059103"/>
       <w:bookmarkEnd w:id="22"/>
       <w:r>
-        <w:t>Deux types de tests automatisés sont mis en place pour garantir la non-régression. Avant chaque exécution, la base est restaurée à un état connu via tests/setup/restore_db.sql et un sanity check vérifie l'intégrité du seed.</w:t>
-      </w:r>
-    </w:p>
-    <w:p>
-      <w:pPr>
-        <w:pStyle w:val="Titre3"/>
-      </w:pPr>
-      <w:bookmarkStart w:id="22" w:name="_Toc229059103"/>
-      <w:bookmarkEnd w:id="22"/>
-      <w:r>
-        <w:t>Tests E2E — Playwright</w:t>
-      </w:r>
-    </w:p>
-    <w:p>
-      <w:pPr/>
-      <w:bookmarkStart w:id="22" w:name="_Toc229059103"/>
-      <w:bookmarkEnd w:id="22"/>
-      <w:r>
-        <w:t>Playwright pilote un vrai navigateur Chromium et exécute des scénarios utilisateurs complets. Le test simule les actions d'un humain : clics, saisies au clavier, navigation. La base de données est réinitialisée avant chaque exécution via tests/setup/restore_db.sql qui charge un seed reproductible (15 ateliers dont 13 visibles, 6 catégories, 26 stagiaires répartis sur avril/mai/juin 2026).</w:t>
-      </w:r>
-    </w:p>
-    <w:p>
-      <w:pPr/>
-      <w:bookmarkStart w:id="22" w:name="_Toc229059103"/>
-      <w:bookmarkEnd w:id="22"/>
-      <w:r>
-        <w:t>Les scénarios couvrent : navigation entre pages, CRUD stagiaire, validation des dates, badges de statut, recherche par nom, comportement en cas d'erreur réseau, tri et groupement par mois, état du formulaire (reset / pré-remplissage), navigation clavier, sécurité XSS dans les champs texte, valeurs limites (255 caractères), CRUD atelier, contrainte de suppression, association ateliers ↔ stages, CRUD catégorie + Cannot Delete Modal, navigation vers le certificat.</w:t>
-      </w:r>
-    </w:p>
-    <w:p>
-      <w:pPr>
-        <w:pStyle w:val="Titre3"/>
-      </w:pPr>
-      <w:bookmarkStart w:id="22" w:name="_Toc229059103"/>
-      <w:bookmarkEnd w:id="22"/>
-      <w:r>
-        <w:t>Tests fonctionnels API — Postman / Newman</w:t>
-      </w:r>
-    </w:p>
-    <w:p>
-      <w:pPr/>
-      <w:bookmarkStart w:id="22" w:name="_Toc229059103"/>
-      <w:bookmarkEnd w:id="22"/>
-      <w:r>
-        <w:t>La collection Postman valide le contrat d'interface de l'API REST. Chaque requête possède des assertions Postman qui vérifient le code HTTP, la structure JSON et les invariants attendus. La collection est exécutable en ligne de commande via Newman (npm run test:api), ce qui permet de l'intégrer à un pipeline CI.</w:t>
-      </w:r>
-    </w:p>
-    <w:p>
-      <w:pPr/>
-      <w:bookmarkStart w:id="22" w:name="_Toc229059103"/>
-      <w:bookmarkEnd w:id="22"/>
-      <w:r>
-        <w:t>La couverture inclut : CRUD complet sur les trois ressources principales, contraintes métier (HTTP 409 pour suppression bloquée, 422 pour validation), endpoints de document (upload/download/delete), et endpoint de génération du certificat.</w:t>
-      </w:r>
-    </w:p>
-    <w:p>
-      <w:pPr>
-        <w:pStyle w:val="Titre3"/>
-      </w:pPr>
-      <w:bookmarkStart w:id="22" w:name="_Toc229059103"/>
-      <w:bookmarkEnd w:id="22"/>
-      <w:r>
-        <w:t>Sanity check d'intégrité de la base</w:t>
-      </w:r>
-    </w:p>
-    <w:p>
-      <w:pPr/>
-      <w:bookmarkStart w:id="22" w:name="_Toc229059103"/>
-      <w:bookmarkEnd w:id="22"/>
-      <w:r>
-        <w:t>Avant chaque suite de tests, un sanity check Playwright et un sanity check Postman vérifient que la restauration s'est correctement déroulée. Les deux suites valident les mêmes invariants : 26 stagiaires au total dans internship, 13 activités visibles renvoyées par GET /api/activities, 6 catégories par défaut. Un spot-check confirme que le stagiaire ID 60 est bien Joël Dacobeau et que le stagiaire ID 1 (Lucas Martin) a les activités 1 et 2 liées dans internship_activity. Si l'un de ces invariants n'est pas respecté, la suite s'arrête immédiatement — inutile de lancer les vrais tests sur des données partielles.</w:t>
-      </w:r>
-    </w:p>
-    <w:p>
-      <w:pPr/>
-      <w:bookmarkStart w:id="22" w:name="_Toc229059103"/>
-      <w:bookmarkEnd w:id="22"/>
-      <w:r>
+        <w:rPr>
+          <w:lang w:val="fr-CH"/>
+        </w:rPr>
         <w:t>Les tests unitaires white-box du code interne n'ont pas été retenus : la logique métier est concentrée dans des services dont le comportement observable est déjà testé indirectement par les deux familles ci-dessus, et dont les implémentations restent simples (pas d'algorithme complexe à isoler).</w:t>
       </w:r>
     </w:p>
@@ -11561,11 +11641,6 @@
           <w:lang w:val="fr-CH"/>
         </w:rPr>
         <w:tab/>
-      </w:r>
-      <w:r>
-        <w:rPr>
-          <w:lang w:val="fr-CH"/>
-        </w:rPr>
         <w:t>DELETE /api/internships/:id — supprime un stage.</w:t>
       </w:r>
     </w:p>
@@ -11679,200 +11754,669 @@
       <w:pPr>
         <w:pStyle w:val="Titre2"/>
       </w:pPr>
-      <w:bookmarkStart w:id="28" w:name="_Toc229059109"/>
       <w:r>
         <w:t>Gestion des ateliers</w:t>
       </w:r>
-      <w:bookmarkEnd w:id="28"/>
-    </w:p>
-    <w:p>
-      <w:pPr/>
+    </w:p>
+    <w:p>
+      <w:pPr>
+        <w:rPr>
+          <w:lang w:val="fr-CH"/>
+        </w:rPr>
+      </w:pPr>
+      <w:r>
+        <w:rPr>
+          <w:lang w:val="fr-CH"/>
+        </w:rPr>
+        <w:t>Les ateliers sont gérés via frontend/src/views/ActivityList.vue et les endpoints /api/activities.</w:t>
+      </w:r>
+    </w:p>
+    <w:p>
+      <w:pPr>
+        <w:rPr>
+          <w:lang w:val="fr-CH"/>
+        </w:rPr>
+      </w:pPr>
+      <w:r>
+        <w:rPr>
+          <w:lang w:val="fr-CH"/>
+        </w:rPr>
+        <w:t>Endpoints API :</w:t>
+      </w:r>
+    </w:p>
+    <w:p>
+      <w:pPr>
+        <w:rPr>
+          <w:lang w:val="fr-CH"/>
+        </w:rPr>
+      </w:pPr>
+      <w:r>
+        <w:rPr>
+          <w:lang w:val="fr-CH"/>
+        </w:rPr>
+        <w:t>-</w:t>
+      </w:r>
+      <w:r>
+        <w:rPr>
+          <w:lang w:val="fr-CH"/>
+        </w:rPr>
+        <w:tab/>
+        <w:t>GET /api/activities — liste les IDs des ateliers visibles (rétrocompatibilité, peu utilisé en production).</w:t>
+      </w:r>
+    </w:p>
+    <w:p>
+      <w:pPr>
+        <w:rPr>
+          <w:lang w:val="fr-CH"/>
+        </w:rPr>
+      </w:pPr>
+      <w:r>
+        <w:rPr>
+          <w:lang w:val="fr-CH"/>
+        </w:rPr>
+        <w:t>-</w:t>
+      </w:r>
+      <w:r>
+        <w:rPr>
+          <w:lang w:val="fr-CH"/>
+        </w:rPr>
+        <w:tab/>
+        <w:t>GET /api/activities/details — liste enrichie de tous les ateliers visibles (titre, description, catégories, internshipCount) en un seul appel. Utilisé par la page principale du catalogue à la place du pattern N+1.</w:t>
+      </w:r>
+    </w:p>
+    <w:p>
+      <w:pPr>
+        <w:rPr>
+          <w:lang w:val="fr-CH"/>
+        </w:rPr>
+      </w:pPr>
+      <w:r>
+        <w:rPr>
+          <w:lang w:val="fr-CH"/>
+        </w:rPr>
+        <w:t>-</w:t>
+      </w:r>
+      <w:r>
+        <w:rPr>
+          <w:lang w:val="fr-CH"/>
+        </w:rPr>
+        <w:tab/>
+        <w:t>GET /api/activities/:id — détails d'un atelier (avec catégories et internshipCount).</w:t>
+      </w:r>
+    </w:p>
+    <w:p>
+      <w:pPr>
+        <w:rPr>
+          <w:lang w:val="fr-CH"/>
+        </w:rPr>
+      </w:pPr>
+      <w:r>
+        <w:rPr>
+          <w:lang w:val="fr-CH"/>
+        </w:rPr>
+        <w:t>-</w:t>
+      </w:r>
+      <w:r>
+        <w:rPr>
+          <w:lang w:val="fr-CH"/>
+        </w:rPr>
+        <w:tab/>
+        <w:t>POST /api/activities — crée un atelier.</w:t>
+      </w:r>
+    </w:p>
+    <w:p>
+      <w:pPr>
+        <w:rPr>
+          <w:lang w:val="fr-CH"/>
+        </w:rPr>
+      </w:pPr>
+      <w:r>
+        <w:rPr>
+          <w:lang w:val="fr-CH"/>
+        </w:rPr>
+        <w:t>-</w:t>
+      </w:r>
+      <w:r>
+        <w:rPr>
+          <w:lang w:val="fr-CH"/>
+        </w:rPr>
+        <w:tab/>
+        <w:t>PATCH /api/activities/:id — modifie partiellement un atelier.</w:t>
+      </w:r>
+    </w:p>
+    <w:p>
+      <w:pPr>
+        <w:rPr>
+          <w:lang w:val="fr-CH"/>
+        </w:rPr>
+      </w:pPr>
+      <w:r>
+        <w:rPr>
+          <w:lang w:val="fr-CH"/>
+        </w:rPr>
+        <w:t>-</w:t>
+      </w:r>
+      <w:r>
+        <w:rPr>
+          <w:lang w:val="fr-CH"/>
+        </w:rPr>
+        <w:tab/>
+        <w:t>DELETE /api/activities/:id — soft delete (visible = 0).</w:t>
+      </w:r>
+    </w:p>
+    <w:p>
+      <w:pPr>
+        <w:rPr>
+          <w:lang w:val="fr-CH"/>
+        </w:rPr>
+      </w:pPr>
+      <w:r>
+        <w:rPr>
+          <w:lang w:val="fr-CH"/>
+        </w:rPr>
+        <w:t>-</w:t>
+      </w:r>
+      <w:r>
+        <w:rPr>
+          <w:lang w:val="fr-CH"/>
+        </w:rPr>
+        <w:tab/>
+        <w:t>POST /api/activities/:id/document — upload d'un document.</w:t>
+      </w:r>
+    </w:p>
+    <w:p>
+      <w:pPr>
+        <w:rPr>
+          <w:lang w:val="fr-CH"/>
+        </w:rPr>
+      </w:pPr>
+      <w:r>
+        <w:rPr>
+          <w:lang w:val="fr-CH"/>
+        </w:rPr>
+        <w:t>-</w:t>
+      </w:r>
+      <w:r>
+        <w:rPr>
+          <w:lang w:val="fr-CH"/>
+        </w:rPr>
+        <w:tab/>
+        <w:t>GET /api/activities/:id/document — téléchargement du document.</w:t>
+      </w:r>
+    </w:p>
+    <w:p>
+      <w:pPr>
+        <w:rPr>
+          <w:lang w:val="fr-CH"/>
+        </w:rPr>
+      </w:pPr>
+      <w:r>
+        <w:rPr>
+          <w:lang w:val="fr-CH"/>
+        </w:rPr>
+        <w:t>-</w:t>
+      </w:r>
+      <w:r>
+        <w:rPr>
+          <w:lang w:val="fr-CH"/>
+        </w:rPr>
+        <w:tab/>
+        <w:t>DELETE /api/activities/:id/document — suppression du document.</w:t>
+      </w:r>
+    </w:p>
+    <w:p>
+      <w:pPr>
+        <w:rPr>
+          <w:lang w:val="fr-CH"/>
+        </w:rPr>
+      </w:pPr>
+      <w:r>
+        <w:rPr>
+          <w:lang w:val="fr-CH"/>
+        </w:rPr>
+        <w:t>Note importante sur l'ordre des routes : /details doit être déclaré avant /:id dans le routeur Express, sinon le router matche /details comme :id = "details" et appelle le mauvais handler.</w:t>
+      </w:r>
+    </w:p>
+    <w:p>
+      <w:pPr>
+        <w:rPr>
+          <w:lang w:val="fr-CH"/>
+        </w:rPr>
+      </w:pPr>
+      <w:r>
+        <w:rPr>
+          <w:lang w:val="fr-CH"/>
+        </w:rPr>
+        <w:t>Côté backend, Activity.getById et Activity.getAllDetails utilisent une seule requête SQL chacun (LEFT JOIN sur activity_category + category, GROUP_CONCAT pour bundler les ids et noms de catégories, sous-requête corrélée pour le compteur d'internships). Un helper privé mapRow(row) réutilisé par les deux méthodes garantit que la liste et le détail produisent exactement le même objet JavaScript. Cette consolidation divise par 3 le nombre de requêtes SQL par activité chargée.</w:t>
+      </w:r>
+    </w:p>
+    <w:p>
+      <w:pPr>
+        <w:rPr>
+          <w:lang w:val="fr-CH"/>
+        </w:rPr>
+      </w:pPr>
+      <w:r>
+        <w:rPr>
+          <w:lang w:val="fr-CH"/>
+        </w:rPr>
+        <w:t>Côté frontend, le composable useActivityList charge le catalogue en un seul appel HTTP (await getActivityDetails()) au lieu de l'ancien pattern 1 + N (un GET /api/activities puis 13 GET /api/activities/:id en parallèle). Pour 13 ateliers seedés, cela réduit la charge de 14 à 1 round-trip.</w:t>
+      </w:r>
+    </w:p>
+    <w:p>
+      <w:pPr>
+        <w:rPr>
+          <w:lang w:val="fr-CH"/>
+        </w:rPr>
+      </w:pPr>
+      <w:r>
+        <w:rPr>
+          <w:lang w:val="fr-CH"/>
+        </w:rPr>
+        <w:t xml:space="preserve">Chaque atelier est affiché sous forme d'une carte cliquable. La carte compacte montre l'icône, le titre, les badges de catégories non-supprimables et la description tronquée. La carte dépliée ajoute deux blocs : la zone Documentation (upload drag &amp; drop ou affichage du fichier existant avec boutons </w:t>
+      </w:r>
+      <w:r>
+        <w:rPr>
+          <w:lang w:val="fr-CH"/>
+        </w:rPr>
+        <w:lastRenderedPageBreak/>
+        <w:t>Voir/Télécharger/Supprimer/Remplacer) et la zone Catégories (badges supprimables au hover + popover « Ajouter une catégorie »). Les icônes utilisées dans le bloc documentation sont des icônes Lucide (FileText, Eye, Download, Trash2, RefreshCw, Paperclip) avec aria-labels pour l'accessibilité — pas d'emojis Unicode dans le markup.</w:t>
+      </w:r>
+    </w:p>
+    <w:p>
+      <w:pPr>
+        <w:rPr>
+          <w:lang w:val="fr-CH"/>
+        </w:rPr>
+      </w:pPr>
+      <w:r>
+        <w:rPr>
+          <w:lang w:val="fr-CH"/>
+        </w:rPr>
+        <w:t>La suppression d'un atelier est bloquée s'il est lié à au moins un stage. La règle est appliquée à deux niveaux : le service backend lève HAS_LINKED_INTERNSHIPS (HTTP 409) si internshipCount &gt; 0, et le frontend désactive le bouton avec un aria-label informatif. La suppression effective est implémentée comme un soft delete pour préserver l'intégrité des données historiques.</w:t>
+      </w:r>
+    </w:p>
+    <w:p>
+      <w:pPr>
+        <w:rPr>
+          <w:lang w:val="fr-CH"/>
+        </w:rPr>
+      </w:pPr>
       <w:bookmarkStart w:id="28" w:name="_Toc229059109"/>
       <w:bookmarkEnd w:id="28"/>
       <w:r>
-        <w:t>Les ateliers sont gérés via frontend/src/views/ActivityList.vue et les endpoints /api/activities.</w:t>
-      </w:r>
-    </w:p>
-    <w:p>
-      <w:pPr/>
-      <w:bookmarkStart w:id="28" w:name="_Toc229059109"/>
-      <w:bookmarkEnd w:id="28"/>
-      <w:r>
+        <w:rPr>
+          <w:lang w:val="fr-CH"/>
+        </w:rPr>
+        <w:t>Activity.create et Activity.update sont enveloppés dans une transaction SQL (beginTransaction / commit / rollback) car ils écrivent sur deux tables (activity et activity_category). Sans transaction, une erreur dans la boucle d'INSERT activity_category laissait précédemment soit un atelier orphelin sans catégories, soit un atelier privé de toutes ses catégories après une mise à jour interrompue.</w:t>
+      </w:r>
+    </w:p>
+    <w:p>
+      <w:pPr>
+        <w:pStyle w:val="Titre2"/>
+      </w:pPr>
+      <w:bookmarkStart w:id="29" w:name="_Toc229059110"/>
+      <w:r>
+        <w:t>Gestion des catégories</w:t>
+      </w:r>
+      <w:bookmarkEnd w:id="29"/>
+    </w:p>
+    <w:p>
+      <w:pPr>
+        <w:rPr>
+          <w:lang w:val="fr-CH"/>
+        </w:rPr>
+      </w:pPr>
+      <w:r>
+        <w:rPr>
+          <w:lang w:val="fr-CH"/>
+        </w:rPr>
+        <w:t>Les catégories sont gérées via frontend/src/views/CategoryList.vue et les endpoints /api/categories.</w:t>
+      </w:r>
+    </w:p>
+    <w:p>
+      <w:pPr>
+        <w:rPr>
+          <w:lang w:val="fr-CH"/>
+        </w:rPr>
+      </w:pPr>
+      <w:r>
+        <w:rPr>
+          <w:lang w:val="fr-CH"/>
+        </w:rPr>
         <w:t>Endpoints API :</w:t>
       </w:r>
     </w:p>
     <w:p>
-      <w:pPr/>
-      <w:bookmarkStart w:id="28" w:name="_Toc229059109"/>
-      <w:bookmarkEnd w:id="28"/>
-      <w:r>
+      <w:pPr>
+        <w:rPr>
+          <w:lang w:val="fr-CH"/>
+        </w:rPr>
+      </w:pPr>
+      <w:r>
+        <w:rPr>
+          <w:lang w:val="fr-CH"/>
+        </w:rPr>
         <w:t>-</w:t>
-        <w:tab/>
-        <w:t>GET /api/activities — liste les IDs des ateliers visibles (rétrocompatibilité, peu utilisé en production).</w:t>
-      </w:r>
-    </w:p>
-    <w:p>
-      <w:pPr/>
-      <w:bookmarkStart w:id="28" w:name="_Toc229059109"/>
-      <w:bookmarkEnd w:id="28"/>
-      <w:r>
+      </w:r>
+      <w:r>
+        <w:rPr>
+          <w:lang w:val="fr-CH"/>
+        </w:rPr>
+        <w:tab/>
+        <w:t>GET /api/categories — liste avec activityCount.</w:t>
+      </w:r>
+    </w:p>
+    <w:p>
+      <w:pPr>
+        <w:rPr>
+          <w:lang w:val="fr-CH"/>
+        </w:rPr>
+      </w:pPr>
+      <w:r>
+        <w:rPr>
+          <w:lang w:val="fr-CH"/>
+        </w:rPr>
         <w:t>-</w:t>
-        <w:tab/>
-        <w:t>GET /api/activities/details — liste enrichie de tous les ateliers visibles (titre, description, catégories, internshipCount) en un seul appel. Utilisé par la page principale du catalogue à la place du pattern N+1.</w:t>
-      </w:r>
-    </w:p>
-    <w:p>
-      <w:pPr/>
-      <w:bookmarkStart w:id="28" w:name="_Toc229059109"/>
-      <w:bookmarkEnd w:id="28"/>
-      <w:r>
+      </w:r>
+      <w:r>
+        <w:rPr>
+          <w:lang w:val="fr-CH"/>
+        </w:rPr>
+        <w:tab/>
+        <w:t>POST /api/categories — crée une catégorie.</w:t>
+      </w:r>
+    </w:p>
+    <w:p>
+      <w:pPr>
+        <w:rPr>
+          <w:lang w:val="fr-CH"/>
+        </w:rPr>
+      </w:pPr>
+      <w:r>
+        <w:rPr>
+          <w:lang w:val="fr-CH"/>
+        </w:rPr>
         <w:t>-</w:t>
-        <w:tab/>
-        <w:t>GET /api/activities/:id — détails d'un atelier (avec catégories et internshipCount).</w:t>
-      </w:r>
-    </w:p>
-    <w:p>
-      <w:pPr/>
-      <w:bookmarkStart w:id="28" w:name="_Toc229059109"/>
-      <w:bookmarkEnd w:id="28"/>
-      <w:r>
+      </w:r>
+      <w:r>
+        <w:rPr>
+          <w:lang w:val="fr-CH"/>
+        </w:rPr>
+        <w:tab/>
+        <w:t>PUT /api/categories/:id — modifie une catégorie.</w:t>
+      </w:r>
+    </w:p>
+    <w:p>
+      <w:pPr>
+        <w:rPr>
+          <w:lang w:val="fr-CH"/>
+        </w:rPr>
+      </w:pPr>
+      <w:r>
+        <w:rPr>
+          <w:lang w:val="fr-CH"/>
+        </w:rPr>
         <w:t>-</w:t>
-        <w:tab/>
-        <w:t>POST /api/activities — crée un atelier.</w:t>
-      </w:r>
-    </w:p>
-    <w:p>
-      <w:pPr/>
-      <w:bookmarkStart w:id="28" w:name="_Toc229059109"/>
-      <w:bookmarkEnd w:id="28"/>
-      <w:r>
+      </w:r>
+      <w:r>
+        <w:rPr>
+          <w:lang w:val="fr-CH"/>
+        </w:rPr>
+        <w:tab/>
+        <w:t>DELETE /api/categories/:id — supprime une catégorie (bloqué si activityCount &gt; 0).</w:t>
+      </w:r>
+    </w:p>
+    <w:p>
+      <w:pPr>
+        <w:rPr>
+          <w:lang w:val="fr-CH"/>
+        </w:rPr>
+      </w:pPr>
+      <w:r>
+        <w:rPr>
+          <w:lang w:val="fr-CH"/>
+        </w:rPr>
+        <w:t>L'interface présente une grille de cartes responsive avec icône Tag, nom, description optionnelle et compteur d'ateliers liés au format « 1 atelier » / « 2 ateliers » / « 0 atelier ».</w:t>
+      </w:r>
+    </w:p>
+    <w:p>
+      <w:pPr>
+        <w:rPr>
+          <w:lang w:val="fr-CH"/>
+        </w:rPr>
+      </w:pPr>
+      <w:r>
+        <w:rPr>
+          <w:lang w:val="fr-CH"/>
+        </w:rPr>
+        <w:t>La contrainte de suppression est appliquée en deux étapes : le service deleteCategory récupère d'abord la catégorie via getById (qui inclut activityCount), puis lève HAS_LINKED_ACTIVITIES si activityCount &gt; 0 sans appeler la base. Le controller intercepte cette erreur et retourne HTTP 409. Côté frontend, une modal « Suppression impossible » (AppDialog) s'affiche avec le nom de la catégorie concernée.</w:t>
+      </w:r>
+    </w:p>
+    <w:p>
+      <w:pPr>
+        <w:pStyle w:val="Titre2"/>
+      </w:pPr>
+      <w:bookmarkStart w:id="30" w:name="_Toc229059111"/>
+      <w:r>
+        <w:t>Génération du certificat</w:t>
+      </w:r>
+      <w:bookmarkEnd w:id="30"/>
+    </w:p>
+    <w:p>
+      <w:pPr>
+        <w:rPr>
+          <w:lang w:val="fr-CH"/>
+        </w:rPr>
+      </w:pPr>
+      <w:r>
+        <w:rPr>
+          <w:lang w:val="fr-CH"/>
+        </w:rPr>
+        <w:t>La génération du certificat de stage en PDF est implémentée via carbone.js avec un template DOCX personnalisable.</w:t>
+      </w:r>
+    </w:p>
+    <w:p>
+      <w:pPr>
+        <w:rPr>
+          <w:lang w:val="fr-CH"/>
+        </w:rPr>
+      </w:pPr>
+      <w:r>
+        <w:rPr>
+          <w:lang w:val="fr-CH"/>
+        </w:rPr>
+        <w:t>Flux complet :</w:t>
+      </w:r>
+    </w:p>
+    <w:p>
+      <w:pPr>
+        <w:rPr>
+          <w:lang w:val="fr-CH"/>
+        </w:rPr>
+      </w:pPr>
+      <w:r>
+        <w:rPr>
+          <w:lang w:val="fr-CH"/>
+        </w:rPr>
         <w:t>-</w:t>
-        <w:tab/>
-        <w:t>PATCH /api/activities/:id — modifie partiellement un atelier.</w:t>
-      </w:r>
-    </w:p>
-    <w:p>
-      <w:pPr/>
-      <w:bookmarkStart w:id="28" w:name="_Toc229059109"/>
-      <w:bookmarkEnd w:id="28"/>
-      <w:r>
+      </w:r>
+      <w:r>
+        <w:rPr>
+          <w:lang w:val="fr-CH"/>
+        </w:rPr>
+        <w:tab/>
+        <w:t>L'administrateur uploade un template DOCX via la page Paramètres (POST /api/certificate/template).</w:t>
+      </w:r>
+    </w:p>
+    <w:p>
+      <w:pPr>
+        <w:rPr>
+          <w:lang w:val="fr-CH"/>
+        </w:rPr>
+      </w:pPr>
+      <w:r>
+        <w:rPr>
+          <w:lang w:val="fr-CH"/>
+        </w:rPr>
         <w:t>-</w:t>
-        <w:tab/>
-        <w:t>DELETE /api/activities/:id — soft delete (visible = 0).</w:t>
-      </w:r>
-    </w:p>
-    <w:p>
-      <w:pPr/>
-      <w:bookmarkStart w:id="28" w:name="_Toc229059109"/>
-      <w:bookmarkEnd w:id="28"/>
-      <w:r>
+      </w:r>
+      <w:r>
+        <w:rPr>
+          <w:lang w:val="fr-CH"/>
+        </w:rPr>
+        <w:tab/>
+        <w:t>Le template est stocké dans /app/uploads/certificate/template.docx.</w:t>
+      </w:r>
+    </w:p>
+    <w:p>
+      <w:pPr>
+        <w:rPr>
+          <w:lang w:val="fr-CH"/>
+        </w:rPr>
+      </w:pPr>
+      <w:r>
+        <w:rPr>
+          <w:lang w:val="fr-CH"/>
+        </w:rPr>
         <w:t>-</w:t>
-        <w:tab/>
-        <w:t>POST /api/activities/:id/document — upload d'un document.</w:t>
-      </w:r>
-    </w:p>
-    <w:p>
-      <w:pPr/>
-      <w:bookmarkStart w:id="28" w:name="_Toc229059109"/>
-      <w:bookmarkEnd w:id="28"/>
-      <w:r>
+      </w:r>
+      <w:r>
+        <w:rPr>
+          <w:lang w:val="fr-CH"/>
+        </w:rPr>
+        <w:tab/>
+        <w:t>Sur la carte d'un stage, le bouton « Aperçu du certificat » navigue vers /certificate/:id.</w:t>
+      </w:r>
+    </w:p>
+    <w:p>
+      <w:pPr>
+        <w:rPr>
+          <w:lang w:val="fr-CH"/>
+        </w:rPr>
+      </w:pPr>
+      <w:r>
+        <w:rPr>
+          <w:lang w:val="fr-CH"/>
+        </w:rPr>
         <w:t>-</w:t>
-        <w:tab/>
-        <w:t>GET /api/activities/:id/document — téléchargement du document.</w:t>
-      </w:r>
-    </w:p>
-    <w:p>
-      <w:pPr/>
-      <w:bookmarkStart w:id="28" w:name="_Toc229059109"/>
-      <w:bookmarkEnd w:id="28"/>
-      <w:r>
+      </w:r>
+      <w:r>
+        <w:rPr>
+          <w:lang w:val="fr-CH"/>
+        </w:rPr>
+        <w:tab/>
+        <w:t>Le backend récupère les données du stage et les ateliers associés.</w:t>
+      </w:r>
+    </w:p>
+    <w:p>
+      <w:pPr>
+        <w:rPr>
+          <w:lang w:val="fr-CH"/>
+        </w:rPr>
+      </w:pPr>
+      <w:r>
+        <w:rPr>
+          <w:lang w:val="fr-CH"/>
+        </w:rPr>
         <w:t>-</w:t>
-        <w:tab/>
-        <w:t>DELETE /api/activities/:id/document — suppression du document.</w:t>
-      </w:r>
-    </w:p>
-    <w:p>
-      <w:pPr/>
-      <w:bookmarkStart w:id="28" w:name="_Toc229059109"/>
-      <w:bookmarkEnd w:id="28"/>
-      <w:r>
-        <w:t>Note importante sur l'ordre des routes : /details doit être déclaré avant /:id dans le routeur Express, sinon le router matche /details comme :id = "details" et appelle le mauvais handler.</w:t>
-      </w:r>
-    </w:p>
-    <w:p>
-      <w:pPr/>
-      <w:bookmarkStart w:id="28" w:name="_Toc229059109"/>
-      <w:bookmarkEnd w:id="28"/>
-      <w:r>
-        <w:t>Côté backend, Activity.getById et Activity.getAllDetails utilisent une seule requête SQL chacun (LEFT JOIN sur activity_category + category, GROUP_CONCAT pour bundler les ids et noms de catégories, sous-requête corrélée pour le compteur d'internships). Un helper privé mapRow(row) réutilisé par les deux méthodes garantit que la liste et le détail produisent exactement le même objet JavaScript. Cette consolidation divise par 3 le nombre de requêtes SQL par activité chargée.</w:t>
-      </w:r>
-    </w:p>
-    <w:p>
-      <w:pPr/>
-      <w:bookmarkStart w:id="28" w:name="_Toc229059109"/>
-      <w:bookmarkEnd w:id="28"/>
-      <w:r>
-        <w:t>Côté frontend, le composable useActivityList charge le catalogue en un seul appel HTTP (await getActivityDetails()) au lieu de l'ancien pattern 1 + N (un GET /api/activities puis 13 GET /api/activities/:id en parallèle). Pour 13 ateliers seedés, cela réduit la charge de 14 à 1 round-trip.</w:t>
-      </w:r>
-    </w:p>
-    <w:p>
-      <w:pPr/>
-      <w:bookmarkStart w:id="28" w:name="_Toc229059109"/>
-      <w:bookmarkEnd w:id="28"/>
-      <w:r>
-        <w:t>Chaque atelier est affiché sous forme d'une carte cliquable. La carte compacte montre l'icône, le titre, les badges de catégories non-supprimables et la description tronquée. La carte dépliée ajoute deux blocs : la zone Documentation (upload drag &amp; drop ou affichage du fichier existant avec boutons Voir/Télécharger/Supprimer/Remplacer) et la zone Catégories (badges supprimables au hover + popover « Ajouter une catégorie »). Les icônes utilisées dans le bloc documentation sont des icônes Lucide (FileText, Eye, Download, Trash2, RefreshCw, Paperclip) avec aria-labels pour l'accessibilité — pas d'emojis Unicode dans le markup.</w:t>
-      </w:r>
-    </w:p>
-    <w:p>
-      <w:pPr/>
-      <w:bookmarkStart w:id="28" w:name="_Toc229059109"/>
-      <w:bookmarkEnd w:id="28"/>
-      <w:r>
-        <w:t>La suppression d'un atelier est bloquée s'il est lié à au moins un stage. La règle est appliquée à deux niveaux : le service backend lève HAS_LINKED_INTERNSHIPS (HTTP 409) si internshipCount &gt; 0, et le frontend désactive le bouton avec un aria-label informatif. La suppression effective est implémentée comme un soft delete pour préserver l'intégrité des données historiques.</w:t>
-      </w:r>
-    </w:p>
-    <w:p>
-      <w:pPr/>
-      <w:bookmarkStart w:id="28" w:name="_Toc229059109"/>
-      <w:bookmarkEnd w:id="28"/>
-      <w:r>
-        <w:t>Activity.create et Activity.update sont enveloppés dans une transaction SQL (beginTransaction / commit / rollback) car ils écrivent sur deux tables (activity et activity_category). Sans transaction, une erreur dans la boucle d'INSERT activity_category laissait précédemment soit un atelier orphelin sans catégories, soit un atelier privé de toutes ses catégories après une mise à jour interrompue.</w:t>
+      </w:r>
+      <w:r>
+        <w:rPr>
+          <w:lang w:val="fr-CH"/>
+        </w:rPr>
+        <w:tab/>
+        <w:t>carbone.js injecte les données dans le template via les balises {d.prenom}, {d.nom}, {d.email}, {d.date_debut}, {d.date_fin}, {d.date_emission}, {d.ateliers[i].titre} / {d.ateliers[i+1].titre} pour la boucle.</w:t>
+      </w:r>
+    </w:p>
+    <w:p>
+      <w:pPr>
+        <w:rPr>
+          <w:lang w:val="fr-CH"/>
+        </w:rPr>
+      </w:pPr>
+      <w:r>
+        <w:rPr>
+          <w:lang w:val="fr-CH"/>
+        </w:rPr>
+        <w:t>-</w:t>
+      </w:r>
+      <w:r>
+        <w:rPr>
+          <w:lang w:val="fr-CH"/>
+        </w:rPr>
+        <w:tab/>
+        <w:t>LibreOffice (installé dans le conteneur backend Alpine) convertit le DOCX en PDF.</w:t>
+      </w:r>
+    </w:p>
+    <w:p>
+      <w:pPr>
+        <w:rPr>
+          <w:lang w:val="fr-CH"/>
+        </w:rPr>
+      </w:pPr>
+      <w:r>
+        <w:rPr>
+          <w:lang w:val="fr-CH"/>
+        </w:rPr>
+        <w:t>-</w:t>
+      </w:r>
+      <w:r>
+        <w:rPr>
+          <w:lang w:val="fr-CH"/>
+        </w:rPr>
+        <w:tab/>
+        <w:t>Le PDF est renvoyé au frontend comme flux binaire et affiché dans un &lt;iframe&gt;.</w:t>
+      </w:r>
+    </w:p>
+    <w:p>
+      <w:pPr>
+        <w:rPr>
+          <w:lang w:val="fr-CH"/>
+        </w:rPr>
+      </w:pPr>
+      <w:r>
+        <w:rPr>
+          <w:lang w:val="fr-CH"/>
+        </w:rPr>
+        <w:t>La fonction generateCertificate est une async function pure utilisant promisify(carbone.render) du module node:util. Ce choix évite l'anti-pattern new Promise(async (resolve, reject) =&gt; { await ... }), qui provoque des rejections non gérées si un await interne lève une exception.</w:t>
+      </w:r>
+    </w:p>
+    <w:p>
+      <w:pPr>
+        <w:rPr>
+          <w:lang w:val="fr-CH"/>
+        </w:rPr>
+      </w:pPr>
+      <w:r>
+        <w:rPr>
+          <w:lang w:val="fr-CH"/>
+        </w:rPr>
+        <w:t>LibreOffice est installé dans l'image backend via apk add libreoffice + fonts. Important : la variable d'environnement PATH du Dockerfile doit inclure /usr/lib/libreoffice/program car carbone.js appelle directement soffice.bin (et non soffice). Sans cette extension du PATH, l'erreur est cryptique (« Cannot find LibreOffice »).</w:t>
       </w:r>
     </w:p>
     <w:p>
       <w:pPr>
         <w:pStyle w:val="Titre2"/>
       </w:pPr>
-      <w:bookmarkStart w:id="29" w:name="_Toc229059110"/>
-      <w:r>
-        <w:t>Gestion des catégories</w:t>
-      </w:r>
-      <w:bookmarkEnd w:id="29"/>
-    </w:p>
-    <w:p>
-      <w:pPr>
-        <w:rPr>
-          <w:lang w:val="fr-CH"/>
-        </w:rPr>
-      </w:pPr>
-      <w:r>
-        <w:rPr>
-          <w:lang w:val="fr-CH"/>
-        </w:rPr>
-        <w:t>Les catégories sont gérées via frontend/src/views/CategoryList.vue et les endpoints /api/categories.</w:t>
-      </w:r>
-    </w:p>
-    <w:p>
-      <w:pPr>
-        <w:rPr>
-          <w:lang w:val="fr-CH"/>
-        </w:rPr>
-      </w:pPr>
-      <w:r>
-        <w:rPr>
-          <w:lang w:val="fr-CH"/>
-        </w:rPr>
-        <w:t>Endpoints API :</w:t>
+      <w:bookmarkStart w:id="31" w:name="_Toc229059112"/>
+      <w:r>
+        <w:lastRenderedPageBreak/>
+        <w:t>Validation des données</w:t>
+      </w:r>
+      <w:bookmarkEnd w:id="31"/>
+    </w:p>
+    <w:p>
+      <w:pPr>
+        <w:rPr>
+          <w:lang w:val="fr-CH"/>
+        </w:rPr>
+      </w:pPr>
+      <w:r>
+        <w:rPr>
+          <w:lang w:val="fr-CH"/>
+        </w:rPr>
+        <w:t>Le backend est la source de vérité pour la validation. Chaque service expose un helper validateFields(data, { partial }) mutualisé entre les opérations create et update. Les règles principales sont :</w:t>
       </w:r>
     </w:p>
     <w:p>
@@ -11892,7 +12436,300 @@
           <w:lang w:val="fr-CH"/>
         </w:rPr>
         <w:tab/>
-        <w:t>GET /api/categories — liste avec activityCount.</w:t>
+        <w:t>Stagiaires : prénom et nom (1–50 caractères), email (regex format valide, ≤ 254 caractères), dates au format YYYY-MM-DD, end_date ≥ start_date.</w:t>
+      </w:r>
+    </w:p>
+    <w:p>
+      <w:pPr>
+        <w:rPr>
+          <w:lang w:val="fr-CH"/>
+        </w:rPr>
+      </w:pPr>
+      <w:r>
+        <w:rPr>
+          <w:lang w:val="fr-CH"/>
+        </w:rPr>
+        <w:t>-</w:t>
+      </w:r>
+      <w:r>
+        <w:rPr>
+          <w:lang w:val="fr-CH"/>
+        </w:rPr>
+        <w:tab/>
+        <w:t>Ateliers : titre obligatoire (3–255 caractères), description et catégories optionnelles.</w:t>
+      </w:r>
+    </w:p>
+    <w:p>
+      <w:pPr>
+        <w:rPr>
+          <w:lang w:val="fr-CH"/>
+        </w:rPr>
+      </w:pPr>
+      <w:r>
+        <w:rPr>
+          <w:lang w:val="fr-CH"/>
+        </w:rPr>
+        <w:t>-</w:t>
+      </w:r>
+      <w:r>
+        <w:rPr>
+          <w:lang w:val="fr-CH"/>
+        </w:rPr>
+        <w:tab/>
+        <w:t>Catégories : nom obligatoire (1–100 caractères), description optionnelle.</w:t>
+      </w:r>
+    </w:p>
+    <w:p>
+      <w:pPr>
+        <w:rPr>
+          <w:lang w:val="fr-CH"/>
+        </w:rPr>
+      </w:pPr>
+      <w:r>
+        <w:rPr>
+          <w:lang w:val="fr-CH"/>
+        </w:rPr>
+        <w:t>-</w:t>
+      </w:r>
+      <w:r>
+        <w:rPr>
+          <w:lang w:val="fr-CH"/>
+        </w:rPr>
+        <w:tab/>
+        <w:t>Documents d'ateliers : type MIME parmi PDF, DOCX, ODT, PPTX, TXT, XLSX, ODS ; taille ≤ 10 Mo.</w:t>
+      </w:r>
+    </w:p>
+    <w:p>
+      <w:r>
+        <w:rPr>
+          <w:lang w:val="fr-CH"/>
+        </w:rPr>
+        <w:t xml:space="preserve">Le frontend Vue.js valide en miroir de ces règles pour fournir un feedback immédiat à l'utilisateur (messages d'erreur sous chaque champ). </w:t>
+      </w:r>
+      <w:r>
+        <w:t>Aucun frontend ne doit pouvoir contourner les validations backend.</w:t>
+      </w:r>
+    </w:p>
+    <w:p>
+      <w:pPr>
+        <w:pStyle w:val="Titre2"/>
+      </w:pPr>
+      <w:r>
+        <w:t>Base de données</w:t>
+      </w:r>
+    </w:p>
+    <w:p>
+      <w:pPr>
+        <w:rPr>
+          <w:lang w:val="fr-CH"/>
+        </w:rPr>
+      </w:pPr>
+      <w:r>
+        <w:rPr>
+          <w:lang w:val="fr-CH"/>
+        </w:rPr>
+        <w:t>L'accès à MariaDB est géré via le driver officiel mariadb (Node.js) avec un pool de cinq connexions configuré dans backend/config/db.js.</w:t>
+      </w:r>
+    </w:p>
+    <w:p>
+      <w:pPr>
+        <w:rPr>
+          <w:lang w:val="fr-CH"/>
+        </w:rPr>
+      </w:pPr>
+      <w:r>
+        <w:rPr>
+          <w:lang w:val="fr-CH"/>
+        </w:rPr>
+        <w:t>Pattern d'accès : chaque méthode des modèles est enveloppée dans le helper withConnection(fn) exporté par db.js. Ce helper acquiert une connexion auprès du pool, exécute le callback puis libère la connexion dans un bloc finally — y compris en cas d'erreur. Le boilerplate let conn / try / finally / if (conn) conn.end() n'apparaît qu'une seule fois dans le projet, dans le helper. Toutes les méthodes des quatre modèles (Person, Internship, Activity, Category) suivent le même schéma :</w:t>
+      </w:r>
+    </w:p>
+    <w:p>
+      <w:pPr>
+        <w:rPr>
+          <w:lang w:val="fr-CH"/>
+        </w:rPr>
+      </w:pPr>
+      <w:r>
+        <w:rPr>
+          <w:lang w:val="fr-CH"/>
+        </w:rPr>
+        <w:t>return withConnection(async (conn) =&gt; { const rows = await conn.query('SELECT * FROM activity WHERE id = ?', [id]); return rows[0] ?? null; });</w:t>
+      </w:r>
+    </w:p>
+    <w:p>
+      <w:pPr>
+        <w:rPr>
+          <w:lang w:val="fr-CH"/>
+        </w:rPr>
+      </w:pPr>
+      <w:r>
+        <w:rPr>
+          <w:lang w:val="fr-CH"/>
+        </w:rPr>
+        <w:t>Pour les opérations qui touchent plusieurs tables (Activity.create et Activity.update qui écrivent sur activity puis sur activity_category), le callback ouvre une transaction explicite avec await conn.beginTransaction() puis commit ou rollback selon l'issue. Cela garantit l'atomicité : un atelier ne peut pas exister en base sans ses associations de catégories.</w:t>
+      </w:r>
+    </w:p>
+    <w:p>
+      <w:pPr>
+        <w:rPr>
+          <w:lang w:val="fr-CH"/>
+        </w:rPr>
+      </w:pPr>
+      <w:r>
+        <w:rPr>
+          <w:lang w:val="fr-CH"/>
+        </w:rPr>
+        <w:t>Activity.getById et Activity.getAllDetails sont les deux seules méthodes complexes : elles agrègent des données de trois tables (activity, activity_category, category, internship_activity) en une seule requête grâce à un LEFT JOIN suivi de GROUP_CONCAT(DISTINCT c.id ORDER BY c.id) pour les IDs de catégories et GROUP_CONCAT(DISTINCT c.name ORDER BY c.id SEPARATOR '||') pour les noms (le séparateur || évite les conflits avec les virgules dans les noms). Le compteur d'internships est obtenu via une sous-requête corrélée (SELECT COUNT(*) FROM internship_activity ia WHERE ia.activity_id = a.id). Le mapping JavaScript reconstruit ensuite le tableau categories: [{id, name}] à partir des deux GROUP_CONCAT.</w:t>
+      </w:r>
+    </w:p>
+    <w:p>
+      <w:pPr>
+        <w:rPr>
+          <w:lang w:val="fr-CH"/>
+        </w:rPr>
+      </w:pPr>
+      <w:bookmarkStart w:id="32" w:name="_Toc229059113"/>
+      <w:bookmarkEnd w:id="32"/>
+      <w:r>
+        <w:rPr>
+          <w:lang w:val="fr-CH"/>
+        </w:rPr>
+        <w:t>La suppression des ateliers est un soft delete (UPDATE activity SET visible = 0). Les ateliers soft-deleted n'apparaissent pas dans le catalogue (WHERE visible = 1) mais leurs associations dans internship_activity sont préservées pour maintenir l'intégrité des données historiques.</w:t>
+      </w:r>
+    </w:p>
+    <w:p>
+      <w:pPr>
+        <w:pStyle w:val="Titre2"/>
+      </w:pPr>
+      <w:r>
+        <w:t>Traitement des erreurs</w:t>
+      </w:r>
+    </w:p>
+    <w:p>
+      <w:pPr>
+        <w:rPr>
+          <w:lang w:val="fr-CH"/>
+        </w:rPr>
+      </w:pPr>
+      <w:r>
+        <w:rPr>
+          <w:lang w:val="fr-CH"/>
+        </w:rPr>
+        <w:t>Le traitement des erreurs suit une architecture en couches cohérente sur l'ensemble du backend.</w:t>
+      </w:r>
+    </w:p>
+    <w:p>
+      <w:pPr>
+        <w:rPr>
+          <w:lang w:val="fr-CH"/>
+        </w:rPr>
+      </w:pPr>
+      <w:r>
+        <w:rPr>
+          <w:lang w:val="fr-CH"/>
+        </w:rPr>
+        <w:t>Codes HTTP utilisés :</w:t>
+      </w:r>
+    </w:p>
+    <w:p>
+      <w:pPr>
+        <w:rPr>
+          <w:lang w:val="fr-CH"/>
+        </w:rPr>
+      </w:pPr>
+      <w:r>
+        <w:rPr>
+          <w:lang w:val="fr-CH"/>
+        </w:rPr>
+        <w:t>-</w:t>
+      </w:r>
+      <w:r>
+        <w:rPr>
+          <w:lang w:val="fr-CH"/>
+        </w:rPr>
+        <w:tab/>
+        <w:t>200 OK — GET / PATCH / PUT réussi</w:t>
+      </w:r>
+    </w:p>
+    <w:p>
+      <w:pPr>
+        <w:rPr>
+          <w:lang w:val="fr-CH"/>
+        </w:rPr>
+      </w:pPr>
+      <w:r>
+        <w:rPr>
+          <w:lang w:val="fr-CH"/>
+        </w:rPr>
+        <w:t>-</w:t>
+      </w:r>
+      <w:r>
+        <w:rPr>
+          <w:lang w:val="fr-CH"/>
+        </w:rPr>
+        <w:tab/>
+        <w:t>201 Created — POST réussi (ressource créée)</w:t>
+      </w:r>
+    </w:p>
+    <w:p>
+      <w:pPr>
+        <w:rPr>
+          <w:lang w:val="fr-CH"/>
+        </w:rPr>
+      </w:pPr>
+      <w:r>
+        <w:rPr>
+          <w:lang w:val="fr-CH"/>
+        </w:rPr>
+        <w:t>-</w:t>
+      </w:r>
+      <w:r>
+        <w:rPr>
+          <w:lang w:val="fr-CH"/>
+        </w:rPr>
+        <w:tab/>
+        <w:t>204 No Content — DELETE réussi</w:t>
+      </w:r>
+    </w:p>
+    <w:p>
+      <w:pPr>
+        <w:rPr>
+          <w:lang w:val="fr-CH"/>
+        </w:rPr>
+      </w:pPr>
+      <w:r>
+        <w:rPr>
+          <w:lang w:val="fr-CH"/>
+        </w:rPr>
+        <w:t>-</w:t>
+      </w:r>
+      <w:r>
+        <w:rPr>
+          <w:lang w:val="fr-CH"/>
+        </w:rPr>
+        <w:tab/>
+        <w:t>400 Bad Request — Fichier invalide (type, taille)</w:t>
+      </w:r>
+    </w:p>
+    <w:p>
+      <w:pPr>
+        <w:rPr>
+          <w:lang w:val="fr-CH"/>
+        </w:rPr>
+      </w:pPr>
+      <w:r>
+        <w:rPr>
+          <w:lang w:val="fr-CH"/>
+        </w:rPr>
+        <w:t>-</w:t>
+      </w:r>
+      <w:r>
+        <w:rPr>
+          <w:lang w:val="fr-CH"/>
+        </w:rPr>
+        <w:tab/>
+        <w:t>404 Not Found — Ressource non trouvée</w:t>
       </w:r>
     </w:p>
     <w:p>
@@ -11913,7 +12750,7 @@
           <w:lang w:val="fr-CH"/>
         </w:rPr>
         <w:tab/>
-        <w:t>POST /api/categories — crée une catégorie.</w:t>
+        <w:t>409 Conflict — Suppression bloquée (HAS_LINKED_INTERNSHIPS, HAS_LINKED_ACTIVITIES)</w:t>
       </w:r>
     </w:p>
     <w:p>
@@ -11933,7 +12770,7 @@
           <w:lang w:val="fr-CH"/>
         </w:rPr>
         <w:tab/>
-        <w:t>PUT /api/categories/:id — modifie une catégorie.</w:t>
+        <w:t>422 Unprocessable Entity — Données invalides (MISSING_FIELDS, etc.)</w:t>
       </w:r>
     </w:p>
     <w:p>
@@ -11953,69 +12790,7 @@
           <w:lang w:val="fr-CH"/>
         </w:rPr>
         <w:tab/>
-        <w:t>DELETE /api/categories/:id — supprime une catégorie (bloqué si activityCount &gt; 0).</w:t>
-      </w:r>
-    </w:p>
-    <w:p>
-      <w:pPr>
-        <w:rPr>
-          <w:lang w:val="fr-CH"/>
-        </w:rPr>
-      </w:pPr>
-      <w:r>
-        <w:rPr>
-          <w:lang w:val="fr-CH"/>
-        </w:rPr>
-        <w:t>L'interface présente une grille de cartes responsive avec icône Tag, nom, description optionnelle et compteur d'ateliers liés au format « 1 atelier » / « 2 ateliers » / « 0 atelier ».</w:t>
-      </w:r>
-    </w:p>
-    <w:p>
-      <w:pPr>
-        <w:rPr>
-          <w:lang w:val="fr-CH"/>
-        </w:rPr>
-      </w:pPr>
-      <w:r>
-        <w:rPr>
-          <w:lang w:val="fr-CH"/>
-        </w:rPr>
-        <w:t>La contrainte de suppression est appliquée en deux étapes : le service deleteCategory récupère d'abord la catégorie via getById (qui inclut activityCount), puis lève HAS_LINKED_ACTIVITIES si activityCount &gt; 0 sans appeler la base. Le controller intercepte cette erreur et retourne HTTP 409. Côté frontend, une modal « Suppression impossible » (AppDialog) s'affiche avec le nom de la catégorie concernée.</w:t>
-      </w:r>
-    </w:p>
-    <w:p>
-      <w:pPr>
-        <w:pStyle w:val="Titre2"/>
-      </w:pPr>
-      <w:bookmarkStart w:id="30" w:name="_Toc229059111"/>
-      <w:r>
-        <w:t>Génération du certificat</w:t>
-      </w:r>
-      <w:bookmarkEnd w:id="30"/>
-    </w:p>
-    <w:p>
-      <w:pPr>
-        <w:rPr>
-          <w:lang w:val="fr-CH"/>
-        </w:rPr>
-      </w:pPr>
-      <w:r>
-        <w:rPr>
-          <w:lang w:val="fr-CH"/>
-        </w:rPr>
-        <w:t>La génération du certificat de stage en PDF est implémentée via carbone.js avec un template DOCX personnalisable.</w:t>
-      </w:r>
-    </w:p>
-    <w:p>
-      <w:pPr>
-        <w:rPr>
-          <w:lang w:val="fr-CH"/>
-        </w:rPr>
-      </w:pPr>
-      <w:r>
-        <w:rPr>
-          <w:lang w:val="fr-CH"/>
-        </w:rPr>
-        <w:t>Flux complet :</w:t>
+        <w:t>503 Service Unavailable — LibreOffice non disponible (NO_LIBREOFFICE)</w:t>
       </w:r>
     </w:p>
     <w:p>
@@ -12035,478 +12810,60 @@
           <w:lang w:val="fr-CH"/>
         </w:rPr>
         <w:tab/>
-        <w:t>L'administrateur uploade un template DOCX via la page Paramètres (POST /api/certificate/template).</w:t>
-      </w:r>
-    </w:p>
-    <w:p>
-      <w:pPr>
-        <w:rPr>
-          <w:lang w:val="fr-CH"/>
-        </w:rPr>
-      </w:pPr>
-      <w:r>
-        <w:rPr>
-          <w:lang w:val="fr-CH"/>
-        </w:rPr>
-        <w:t>-</w:t>
-      </w:r>
-      <w:r>
-        <w:rPr>
-          <w:lang w:val="fr-CH"/>
-        </w:rPr>
-        <w:tab/>
-        <w:t>Le template est stocké dans /app/uploads/certificate/template.docx.</w:t>
-      </w:r>
-    </w:p>
-    <w:p>
-      <w:pPr>
-        <w:rPr>
-          <w:lang w:val="fr-CH"/>
-        </w:rPr>
-      </w:pPr>
-      <w:r>
-        <w:rPr>
-          <w:lang w:val="fr-CH"/>
-        </w:rPr>
-        <w:t>-</w:t>
-      </w:r>
-      <w:r>
-        <w:rPr>
-          <w:lang w:val="fr-CH"/>
-        </w:rPr>
-        <w:tab/>
-        <w:t>Sur la carte d'un stage, le bouton « Aperçu du certificat » navigue vers /certificate/:id.</w:t>
-      </w:r>
-    </w:p>
-    <w:p>
-      <w:pPr>
-        <w:rPr>
-          <w:lang w:val="fr-CH"/>
-        </w:rPr>
-      </w:pPr>
-      <w:r>
-        <w:rPr>
-          <w:lang w:val="fr-CH"/>
-        </w:rPr>
-        <w:t>-</w:t>
-      </w:r>
-      <w:r>
-        <w:rPr>
-          <w:lang w:val="fr-CH"/>
-        </w:rPr>
-        <w:tab/>
-        <w:t>Le backend récupère les données du stage et les ateliers associés.</w:t>
-      </w:r>
-    </w:p>
-    <w:p>
-      <w:pPr>
-        <w:rPr>
-          <w:lang w:val="fr-CH"/>
-        </w:rPr>
-      </w:pPr>
-      <w:r>
-        <w:rPr>
-          <w:lang w:val="fr-CH"/>
-        </w:rPr>
-        <w:t>-</w:t>
-      </w:r>
-      <w:r>
-        <w:rPr>
-          <w:lang w:val="fr-CH"/>
-        </w:rPr>
-        <w:tab/>
-        <w:t>carbone.js injecte les données dans le template via les balises {d.prenom}, {d.nom}, {d.email}, {d.date_debut}, {d.date_fin}, {d.date_emission}, {d.ateliers[i].titre} / {d.ateliers[i+1].titre} pour la boucle.</w:t>
-      </w:r>
-    </w:p>
-    <w:p>
-      <w:pPr>
-        <w:rPr>
-          <w:lang w:val="fr-CH"/>
-        </w:rPr>
-      </w:pPr>
-      <w:r>
-        <w:rPr>
-          <w:lang w:val="fr-CH"/>
-        </w:rPr>
-        <w:t>-</w:t>
-      </w:r>
-      <w:r>
-        <w:rPr>
-          <w:lang w:val="fr-CH"/>
-        </w:rPr>
-        <w:tab/>
-        <w:t>LibreOffice (installé dans le conteneur backend Alpine) convertit le DOCX en PDF.</w:t>
-      </w:r>
-    </w:p>
-    <w:p>
-      <w:pPr>
-        <w:rPr>
-          <w:lang w:val="fr-CH"/>
-        </w:rPr>
-      </w:pPr>
-      <w:r>
-        <w:rPr>
-          <w:lang w:val="fr-CH"/>
-        </w:rPr>
-        <w:t>-</w:t>
-      </w:r>
-      <w:r>
-        <w:rPr>
-          <w:lang w:val="fr-CH"/>
-        </w:rPr>
-        <w:tab/>
-        <w:t>Le PDF est renvoyé au frontend comme flux binaire et affiché dans un &lt;iframe&gt;.</w:t>
-      </w:r>
-    </w:p>
-    <w:p>
-      <w:pPr>
-        <w:rPr>
-          <w:lang w:val="fr-CH"/>
-        </w:rPr>
-      </w:pPr>
-      <w:r>
-        <w:rPr>
-          <w:lang w:val="fr-CH"/>
-        </w:rPr>
-        <w:t>La fonction generateCertificate est une async function pure utilisant promisify(carbone.render) du module node:util. Ce choix évite l'anti-pattern new Promise(async (resolve, reject) =&gt; { await ... }), qui provoque des rejections non gérées si un await interne lève une exception.</w:t>
-      </w:r>
-    </w:p>
-    <w:p>
-      <w:pPr>
-        <w:rPr>
-          <w:lang w:val="fr-CH"/>
-        </w:rPr>
-      </w:pPr>
-      <w:r>
-        <w:rPr>
-          <w:lang w:val="fr-CH"/>
-        </w:rPr>
-        <w:t>LibreOffice est installé dans l'image backend via apk add libreoffice + fonts. Important : la variable d'environnement PATH du Dockerfile doit inclure /usr/lib/libreoffice/program car carbone.js appelle directement soffice.bin (et non soffice). Sans cette extension du PATH, l'erreur est cryptique (« Cannot find LibreOffice »).</w:t>
-      </w:r>
-    </w:p>
-    <w:p>
-      <w:pPr>
-        <w:pStyle w:val="Titre2"/>
-      </w:pPr>
-      <w:bookmarkStart w:id="31" w:name="_Toc229059112"/>
-      <w:r>
-        <w:t>Validation des données</w:t>
-      </w:r>
-      <w:bookmarkEnd w:id="31"/>
-    </w:p>
-    <w:p>
-      <w:pPr>
-        <w:rPr>
-          <w:lang w:val="fr-CH"/>
-        </w:rPr>
-      </w:pPr>
-      <w:r>
-        <w:rPr>
-          <w:lang w:val="fr-CH"/>
-        </w:rPr>
-        <w:t>Le backend est la source de vérité pour la validation. Chaque service expose un helper validateFields(data, { partial }) mutualisé entre les opérations create et update. Les règles principales sont :</w:t>
-      </w:r>
-    </w:p>
-    <w:p>
-      <w:pPr>
-        <w:rPr>
-          <w:lang w:val="fr-CH"/>
-        </w:rPr>
-      </w:pPr>
-      <w:r>
-        <w:rPr>
-          <w:lang w:val="fr-CH"/>
-        </w:rPr>
-        <w:t>-</w:t>
-      </w:r>
-      <w:r>
-        <w:rPr>
-          <w:lang w:val="fr-CH"/>
-        </w:rPr>
-        <w:tab/>
-        <w:t>Stagiaires : prénom et nom (1–50 caractères), email (regex format valide, ≤ 254 caractères), dates au format YYYY-MM-DD, end_date ≥ start_date.</w:t>
-      </w:r>
-    </w:p>
-    <w:p>
-      <w:pPr>
-        <w:rPr>
-          <w:lang w:val="fr-CH"/>
-        </w:rPr>
-      </w:pPr>
-      <w:r>
-        <w:rPr>
-          <w:lang w:val="fr-CH"/>
-        </w:rPr>
-        <w:t>-</w:t>
-      </w:r>
-      <w:r>
-        <w:rPr>
-          <w:lang w:val="fr-CH"/>
-        </w:rPr>
-        <w:tab/>
-      </w:r>
-      <w:r>
-        <w:rPr>
-          <w:lang w:val="fr-CH"/>
-        </w:rPr>
-        <w:t>Ateliers : titre obligatoire (3–255 caractères), description et catégories optionnelles.</w:t>
-      </w:r>
-    </w:p>
-    <w:p>
-      <w:pPr>
-        <w:rPr>
-          <w:lang w:val="fr-CH"/>
-        </w:rPr>
-      </w:pPr>
-      <w:r>
-        <w:rPr>
-          <w:lang w:val="fr-CH"/>
-        </w:rPr>
-        <w:t>-</w:t>
-      </w:r>
-      <w:r>
-        <w:rPr>
-          <w:lang w:val="fr-CH"/>
-        </w:rPr>
-        <w:tab/>
-        <w:t>Catégories : nom obligatoire (1–100 caractères), description optionnelle.</w:t>
-      </w:r>
-    </w:p>
-    <w:p>
-      <w:pPr>
-        <w:rPr>
-          <w:lang w:val="fr-CH"/>
-        </w:rPr>
-      </w:pPr>
-      <w:r>
-        <w:rPr>
-          <w:lang w:val="fr-CH"/>
-        </w:rPr>
-        <w:t>-</w:t>
-      </w:r>
-      <w:r>
-        <w:rPr>
-          <w:lang w:val="fr-CH"/>
-        </w:rPr>
-        <w:tab/>
-        <w:t>Documents d'ateliers : type MIME parmi PDF, DOCX, ODT, PPTX, TXT, XLSX, ODS ; taille ≤ 10 Mo.</w:t>
-      </w:r>
-    </w:p>
-    <w:p>
-      <w:r>
-        <w:rPr>
-          <w:lang w:val="fr-CH"/>
-        </w:rPr>
-        <w:t xml:space="preserve">Le frontend Vue.js valide en miroir de ces règles pour fournir un feedback immédiat à l'utilisateur (messages d'erreur sous chaque champ). </w:t>
-      </w:r>
-      <w:r>
-        <w:t>Aucun frontend ne doit pouvoir contourner les validations backend.</w:t>
-      </w:r>
-    </w:p>
-    <w:p>
-      <w:pPr>
-        <w:pStyle w:val="Titre2"/>
-      </w:pPr>
-      <w:bookmarkStart w:id="32" w:name="_Toc229059113"/>
-      <w:r>
-        <w:lastRenderedPageBreak/>
-        <w:t>Base de données</w:t>
-      </w:r>
-      <w:bookmarkEnd w:id="32"/>
-    </w:p>
-    <w:p>
-      <w:pPr/>
-      <w:bookmarkStart w:id="32" w:name="_Toc229059113"/>
-      <w:bookmarkEnd w:id="32"/>
-      <w:r>
-        <w:t>L'accès à MariaDB est géré via le driver officiel mariadb (Node.js) avec un pool de cinq connexions configuré dans backend/config/db.js.</w:t>
-      </w:r>
-    </w:p>
-    <w:p>
-      <w:pPr/>
-      <w:bookmarkStart w:id="32" w:name="_Toc229059113"/>
-      <w:bookmarkEnd w:id="32"/>
-      <w:r>
-        <w:t>Pattern d'accès : chaque méthode des modèles est enveloppée dans le helper withConnection(fn) exporté par db.js. Ce helper acquiert une connexion auprès du pool, exécute le callback puis libère la connexion dans un bloc finally — y compris en cas d'erreur. Le boilerplate let conn / try / finally / if (conn) conn.end() n'apparaît qu'une seule fois dans le projet, dans le helper. Toutes les méthodes des quatre modèles (Person, Internship, Activity, Category) suivent le même schéma :</w:t>
-      </w:r>
-    </w:p>
-    <w:p>
-      <w:pPr/>
-      <w:bookmarkStart w:id="32" w:name="_Toc229059113"/>
-      <w:bookmarkEnd w:id="32"/>
-      <w:r>
-        <w:t>return withConnection(async (conn) =&gt; { const rows = await conn.query('SELECT * FROM activity WHERE id = ?', [id]); return rows[0] ?? null; });</w:t>
-      </w:r>
-    </w:p>
-    <w:p>
-      <w:pPr/>
-      <w:bookmarkStart w:id="32" w:name="_Toc229059113"/>
-      <w:bookmarkEnd w:id="32"/>
-      <w:r>
-        <w:t>Pour les opérations qui touchent plusieurs tables (Activity.create et Activity.update qui écrivent sur activity puis sur activity_category), le callback ouvre une transaction explicite avec await conn.beginTransaction() puis commit ou rollback selon l'issue. Cela garantit l'atomicité : un atelier ne peut pas exister en base sans ses associations de catégories.</w:t>
-      </w:r>
-    </w:p>
-    <w:p>
-      <w:pPr/>
-      <w:bookmarkStart w:id="32" w:name="_Toc229059113"/>
-      <w:bookmarkEnd w:id="32"/>
-      <w:r>
-        <w:t>Activity.getById et Activity.getAllDetails sont les deux seules méthodes complexes : elles agrègent des données de trois tables (activity, activity_category, category, internship_activity) en une seule requête grâce à un LEFT JOIN suivi de GROUP_CONCAT(DISTINCT c.id ORDER BY c.id) pour les IDs de catégories et GROUP_CONCAT(DISTINCT c.name ORDER BY c.id SEPARATOR '||') pour les noms (le séparateur || évite les conflits avec les virgules dans les noms). Le compteur d'internships est obtenu via une sous-requête corrélée (SELECT COUNT(*) FROM internship_activity ia WHERE ia.activity_id = a.id). Le mapping JavaScript reconstruit ensuite le tableau categories: [{id, name}] à partir des deux GROUP_CONCAT.</w:t>
-      </w:r>
-    </w:p>
-    <w:p>
-      <w:pPr/>
-      <w:bookmarkStart w:id="32" w:name="_Toc229059113"/>
-      <w:bookmarkEnd w:id="32"/>
-      <w:r>
-        <w:t>La suppression des ateliers est un soft delete (UPDATE activity SET visible = 0). Les ateliers soft-deleted n'apparaissent pas dans le catalogue (WHERE visible = 1) mais leurs associations dans internship_activity sont préservées pour maintenir l'intégrité des données historiques.</w:t>
-      </w:r>
-    </w:p>
-    <w:p>
-      <w:pPr>
-        <w:pStyle w:val="Titre2"/>
-      </w:pPr>
-      <w:bookmarkStart w:id="33" w:name="_Toc229059114"/>
-      <w:r>
-        <w:t>Traitement des erreurs</w:t>
-      </w:r>
-      <w:bookmarkEnd w:id="33"/>
-    </w:p>
-    <w:p>
-      <w:pPr/>
+        <w:t>500 Internal Server Error — Erreur serveur inattendue</w:t>
+      </w:r>
+    </w:p>
+    <w:p>
+      <w:pPr>
+        <w:rPr>
+          <w:lang w:val="fr-CH"/>
+        </w:rPr>
+      </w:pPr>
+      <w:r>
+        <w:rPr>
+          <w:lang w:val="fr-CH"/>
+        </w:rPr>
+        <w:t>Les services lèvent des erreurs avec des codes sémantiques (throw new Error('NOT_FOUND')). Les controllers les interceptent via une table VALIDATION_ERRORS et un helper replyValidationError(err, res) qui mappe chaque code vers le couple [status, message]. Cela découple la logique métier du protocole HTTP et permet de modifier les codes HTTP sans toucher aux services.</w:t>
+      </w:r>
+    </w:p>
+    <w:p>
+      <w:pPr>
+        <w:rPr>
+          <w:lang w:val="fr-CH"/>
+        </w:rPr>
+      </w:pPr>
+      <w:r>
+        <w:rPr>
+          <w:lang w:val="fr-CH"/>
+        </w:rPr>
+        <w:t>Côté frontend, les erreurs API sont interceptées par les services Axios et affichées via des modales (AppDialog) ou des messages inline dans les formulaires. Aucune stack trace n'est exposée à l'utilisateur ; toutes les stack traces sont loggées côté backend par winston dans logs/error.log.</w:t>
+      </w:r>
+    </w:p>
+    <w:p>
+      <w:pPr>
+        <w:rPr>
+          <w:lang w:val="fr-CH"/>
+        </w:rPr>
+      </w:pPr>
+      <w:r>
+        <w:rPr>
+          <w:lang w:val="fr-CH"/>
+        </w:rPr>
+        <w:t>Validation des variables d'environnement au démarrage. backend/server.js vérifie la présence de DB_HOST, DB_USER, DB_PASSWORD et DB_NAME juste après dotenv.config(). Si une de ces variables manque ou est vide, le serveur log une erreur explicite pointant vers .env.example et termine avec process.exit(1) — évite qu'il démarre puis échoue cryptiquement à la première requête DB.</w:t>
+      </w:r>
+    </w:p>
+    <w:p>
+      <w:pPr>
+        <w:rPr>
+          <w:lang w:val="fr-CH"/>
+        </w:rPr>
+      </w:pPr>
       <w:bookmarkStart w:id="33" w:name="_Toc229059114"/>
       <w:bookmarkEnd w:id="33"/>
       <w:r>
-        <w:t>Le traitement des erreurs suit une architecture en couches cohérente sur l'ensemble du backend.</w:t>
-      </w:r>
-    </w:p>
-    <w:p>
-      <w:pPr/>
-      <w:bookmarkStart w:id="33" w:name="_Toc229059114"/>
-      <w:bookmarkEnd w:id="33"/>
-      <w:r>
-        <w:t>Codes HTTP utilisés :</w:t>
-      </w:r>
-    </w:p>
-    <w:p>
-      <w:pPr/>
-      <w:bookmarkStart w:id="33" w:name="_Toc229059114"/>
-      <w:bookmarkEnd w:id="33"/>
-      <w:r>
-        <w:t>-</w:t>
-        <w:tab/>
-        <w:t>200 OK — GET / PATCH / PUT réussi</w:t>
-      </w:r>
-    </w:p>
-    <w:p>
-      <w:pPr/>
-      <w:bookmarkStart w:id="33" w:name="_Toc229059114"/>
-      <w:bookmarkEnd w:id="33"/>
-      <w:r>
-        <w:t>-</w:t>
-        <w:tab/>
-        <w:t>201 Created — POST réussi (ressource créée)</w:t>
-      </w:r>
-    </w:p>
-    <w:p>
-      <w:pPr/>
-      <w:bookmarkStart w:id="33" w:name="_Toc229059114"/>
-      <w:bookmarkEnd w:id="33"/>
-      <w:r>
-        <w:t>-</w:t>
-        <w:tab/>
-        <w:t>204 No Content — DELETE réussi</w:t>
-      </w:r>
-    </w:p>
-    <w:p>
-      <w:pPr/>
-      <w:bookmarkStart w:id="33" w:name="_Toc229059114"/>
-      <w:bookmarkEnd w:id="33"/>
-      <w:r>
-        <w:t>-</w:t>
-        <w:tab/>
-        <w:t>400 Bad Request — Fichier invalide (type, taille)</w:t>
-      </w:r>
-    </w:p>
-    <w:p>
-      <w:pPr/>
-      <w:bookmarkStart w:id="33" w:name="_Toc229059114"/>
-      <w:bookmarkEnd w:id="33"/>
-      <w:r>
-        <w:t>-</w:t>
-        <w:tab/>
-        <w:t>404 Not Found — Ressource non trouvée</w:t>
-      </w:r>
-    </w:p>
-    <w:p>
-      <w:pPr/>
-      <w:bookmarkStart w:id="33" w:name="_Toc229059114"/>
-      <w:bookmarkEnd w:id="33"/>
-      <w:r>
-        <w:t>-</w:t>
-        <w:tab/>
-        <w:t>409 Conflict — Suppression bloquée (HAS_LINKED_INTERNSHIPS, HAS_LINKED_ACTIVITIES)</w:t>
-      </w:r>
-    </w:p>
-    <w:p>
-      <w:pPr/>
-      <w:bookmarkStart w:id="33" w:name="_Toc229059114"/>
-      <w:bookmarkEnd w:id="33"/>
-      <w:r>
-        <w:t>-</w:t>
-        <w:tab/>
-        <w:t>422 Unprocessable Entity — Données invalides (MISSING_FIELDS, etc.)</w:t>
-      </w:r>
-    </w:p>
-    <w:p>
-      <w:pPr/>
-      <w:bookmarkStart w:id="33" w:name="_Toc229059114"/>
-      <w:bookmarkEnd w:id="33"/>
-      <w:r>
-        <w:t>-</w:t>
-        <w:tab/>
-        <w:t>503 Service Unavailable — LibreOffice non disponible (NO_LIBREOFFICE)</w:t>
-      </w:r>
-    </w:p>
-    <w:p>
-      <w:pPr/>
-      <w:bookmarkStart w:id="33" w:name="_Toc229059114"/>
-      <w:bookmarkEnd w:id="33"/>
-      <w:r>
-        <w:t>-</w:t>
-        <w:tab/>
-        <w:t>500 Internal Server Error — Erreur serveur inattendue</w:t>
-      </w:r>
-    </w:p>
-    <w:p>
-      <w:pPr/>
-      <w:bookmarkStart w:id="33" w:name="_Toc229059114"/>
-      <w:bookmarkEnd w:id="33"/>
-      <w:r>
-        <w:t>Les services lèvent des erreurs avec des codes sémantiques (throw new Error('NOT_FOUND')). Les controllers les interceptent via une table VALIDATION_ERRORS et un helper replyValidationError(err, res) qui mappe chaque code vers le couple [status, message]. Cela découple la logique métier du protocole HTTP et permet de modifier les codes HTTP sans toucher aux services.</w:t>
-      </w:r>
-    </w:p>
-    <w:p>
-      <w:pPr/>
-      <w:bookmarkStart w:id="33" w:name="_Toc229059114"/>
-      <w:bookmarkEnd w:id="33"/>
-      <w:r>
-        <w:t>Côté frontend, les erreurs API sont interceptées par les services Axios et affichées via des modales (AppDialog) ou des messages inline dans les formulaires. Aucune stack trace n'est exposée à l'utilisateur ; toutes les stack traces sont loggées côté backend par winston dans logs/error.log.</w:t>
-      </w:r>
-    </w:p>
-    <w:p>
-      <w:pPr/>
-      <w:bookmarkStart w:id="33" w:name="_Toc229059114"/>
-      <w:bookmarkEnd w:id="33"/>
-      <w:r>
-        <w:t>Validation des variables d'environnement au démarrage. backend/server.js vérifie la présence de DB_HOST, DB_USER, DB_PASSWORD et DB_NAME juste après dotenv.config(). Si une de ces variables manque ou est vide, le serveur log une erreur explicite pointant vers .env.example et termine avec process.exit(1) — évite qu'il démarre puis échoue cryptiquement à la première requête DB.</w:t>
-      </w:r>
-    </w:p>
-    <w:p>
-      <w:pPr/>
-      <w:bookmarkStart w:id="33" w:name="_Toc229059114"/>
-      <w:bookmarkEnd w:id="33"/>
-      <w:r>
+        <w:rPr>
+          <w:lang w:val="fr-CH"/>
+        </w:rPr>
         <w:t>Sécurité des opérations filesystem. Les appels à fs.unlinkSync dans activityService (suppression du document associé à un atelier, remplacement d'un document existant) sont enveloppés dans un try / catch qui loggue via logger.warn sans propager l'erreur. La cohérence en base prime sur le nettoyage filesystem : si la suppression du fichier physique échoue (permissions, fichier déjà disparu), l'UPDATE activity SET document_url = NULL s'exécute quand même, évitant ainsi qu'une référence orpheline reste en base.</w:t>
       </w:r>
     </w:p>
@@ -13798,18 +14155,23 @@
       <w:pPr>
         <w:pStyle w:val="Titre1"/>
       </w:pPr>
-      <w:bookmarkStart w:id="36" w:name="_Toc229059117"/>
       <w:r>
         <w:lastRenderedPageBreak/>
         <w:t>Amélioration et évolution</w:t>
       </w:r>
-      <w:bookmarkEnd w:id="36"/>
-    </w:p>
-    <w:p>
-      <w:pPr/>
+    </w:p>
+    <w:p>
+      <w:pPr>
+        <w:rPr>
+          <w:lang w:val="fr-CH"/>
+        </w:rPr>
+      </w:pPr>
       <w:bookmarkStart w:id="36" w:name="_Toc229059117"/>
       <w:bookmarkEnd w:id="36"/>
       <w:r>
+        <w:rPr>
+          <w:lang w:val="fr-CH"/>
+        </w:rPr>
         <w:t>Plusieurs pistes d'amélioration ont été identifiées mais sortent du périmètre du TPI.</w:t>
       </w:r>
     </w:p>
@@ -13831,6 +14193,9 @@
         </w:rPr>
       </w:pPr>
       <w:r>
+        <w:rPr>
+          <w:lang w:val="fr-CH"/>
+        </w:rPr>
         <w:t>L'application est actuellement sans authentification (accès libre en réseau interne HEIA-FR). L'intégration de la CA TIC Authentication Gateway (Microsoft MFA), déjà utilisée par d'autres projets CA TIC, constituerait la prochaine étape logique. Une fois ce point en place, l'application pourrait être exposée hors du réseau interne sans risque pour les données des stagiaires.</w:t>
       </w:r>
     </w:p>
@@ -13852,6 +14217,9 @@
         </w:rPr>
       </w:pPr>
       <w:r>
+        <w:rPr>
+          <w:lang w:val="fr-CH"/>
+        </w:rPr>
         <w:t>Les optimisations majeures côté backend ont déjà été appliquées dans le périmètre du TPI : Activity.getById ramené à une seule requête SQL (LEFT JOIN + GROUP_CONCAT + sous-requête corrélée), nouvel endpoint GET /api/activities/details éliminant le pattern N+1 sur la page principale du catalogue, transactions SQL pour les opérations multi-statements de Activity.create et Activity.update. Les pistes restantes : migrer également les composables de la page Stagiaires (useActivities consommé par DashboardDesktop et DashboardMobile) vers le nouvel endpoint /details ; déplacer les filtres aujourd'hui calculés côté client (par statut, par catégorie) côté serveur si le volume de données augmente significativement.</w:t>
       </w:r>
     </w:p>
@@ -13873,6 +14241,9 @@
         </w:rPr>
       </w:pPr>
       <w:r>
+        <w:rPr>
+          <w:lang w:val="fr-CH"/>
+        </w:rPr>
         <w:t>Le cahier des charges mentionne explicitement les évolutions futures suivantes : intégration de la gestion des inscriptions via FriStages (le modèle de données séparant person et internship a été conçu pour s'y prêter) ; planification des stages directement dans l'application (assistant pour proposer un calendrier optimisé, gestion des places limitées, conflits horaires) ; export des données pour la gestion des certifications (CSV ou Excel des stages d'une année académique).</w:t>
       </w:r>
     </w:p>
@@ -13894,6 +14265,9 @@
         </w:rPr>
       </w:pPr>
       <w:r>
+        <w:rPr>
+          <w:lang w:val="fr-CH"/>
+        </w:rPr>
         <w:t>Internationalisation : l'interface est actuellement en français uniquement, une bascule i18n permettrait d'élargir l'usage. Pipeline CI/CD : un pipeline GitLab CI exécutant automatiquement npm run check + npm run test:api + npm run test:e2e à chaque push libérerait le candidat de l'exécution manuelle. Monitoring : un endpoint /api/metrics au format Prometheus permettrait de suivre l'adoption de l'outil.</w:t>
       </w:r>
     </w:p>
@@ -13957,13 +14331,7 @@
         <w:rPr>
           <w:lang w:val="fr-CH"/>
         </w:rPr>
-        <w:t xml:space="preserve">Les principaux apprentissages personnels de ce TPI sont l'importance d'un cahier des charges clarifié avant de coder, la valeur d'une suite de tests automatisés exécutable en une commande, la rigueur des conventions de codage automatisées (Biome) qui libère l'attention pour les questions architecturales, et la compréhension fine du système de réactivité Vue 3 sur les types comme Set. Si je devais refaire le projet, je commencerais par mettre en place les data-testid Playwright avant tout module fonctionnel </w:t>
-      </w:r>
-      <w:r>
-        <w:rPr>
-          <w:lang w:val="fr-CH"/>
-        </w:rPr>
-        <w:t>— j'ai parfois dû réajuster des sélecteurs après avoir remanié la mise en page.</w:t>
+        <w:t>Les principaux apprentissages personnels de ce TPI sont l'importance d'un cahier des charges clarifié avant de coder, la valeur d'une suite de tests automatisés exécutable en une commande, la rigueur des conventions de codage automatisées (Biome) qui libère l'attention pour les questions architecturales, et la compréhension fine du système de réactivité Vue 3 sur les types comme Set. Si je devais refaire le projet, je commencerais par mettre en place les data-testid Playwright avant tout module fonctionnel — j'ai parfois dû réajuster des sélecteurs après avoir remanié la mise en page.</w:t>
       </w:r>
     </w:p>
     <w:p>
@@ -14044,567 +14412,1027 @@
       <w:pPr>
         <w:pStyle w:val="Titre1"/>
       </w:pPr>
-      <w:bookmarkStart w:id="40" w:name="_Toc229059121"/>
       <w:r>
         <w:lastRenderedPageBreak/>
         <w:t>Sources et références</w:t>
       </w:r>
-      <w:bookmarkEnd w:id="40"/>
-    </w:p>
-    <w:p>
-      <w:pPr/>
+    </w:p>
+    <w:p>
+      <w:pPr>
+        <w:rPr>
+          <w:lang w:val="fr-CH"/>
+        </w:rPr>
+      </w:pPr>
+      <w:r>
+        <w:rPr>
+          <w:lang w:val="fr-CH"/>
+        </w:rPr>
+        <w:t>Cette bibliographie liste les sources utilisées pour la conception, le développement et la documentation du projet. Toutes les URL ont été consultées en mai 2026. Les références sont regroupées par catégorie : technologies imposées, outils, patterns techniques, normes / référentiels, ressources internes HEIA-FR.</w:t>
+      </w:r>
+    </w:p>
+    <w:p>
+      <w:pPr>
+        <w:pStyle w:val="Titre4"/>
+        <w:rPr>
+          <w:lang w:val="fr-CH"/>
+        </w:rPr>
+      </w:pPr>
+      <w:r>
+        <w:rPr>
+          <w:lang w:val="fr-CH"/>
+        </w:rPr>
+        <w:t>Technologies imposées par le cahier des charges</w:t>
+      </w:r>
+    </w:p>
+    <w:p>
+      <w:pPr>
+        <w:rPr>
+          <w:lang w:val="fr-CH"/>
+        </w:rPr>
+      </w:pPr>
+      <w:r>
+        <w:rPr>
+          <w:lang w:val="fr-CH"/>
+        </w:rPr>
+        <w:t>-</w:t>
+      </w:r>
+      <w:r>
+        <w:rPr>
+          <w:lang w:val="fr-CH"/>
+        </w:rPr>
+        <w:tab/>
+        <w:t>Vue.js (équipe core). Vue.js Documentation — Guide officiel. https://vuejs.org/guide/. Consulté en mai 2026.</w:t>
+      </w:r>
+    </w:p>
+    <w:p>
+      <w:pPr>
+        <w:rPr>
+          <w:lang w:val="fr-CH"/>
+        </w:rPr>
+      </w:pPr>
+      <w:r>
+        <w:rPr>
+          <w:lang w:val="fr-CH"/>
+        </w:rPr>
+        <w:t>-</w:t>
+      </w:r>
+      <w:r>
+        <w:rPr>
+          <w:lang w:val="fr-CH"/>
+        </w:rPr>
+        <w:tab/>
+        <w:t>Vue.js (équipe core). Composition API Reference. https://vuejs.org/api/composition-api-setup.html. Consulté en mai 2026.</w:t>
+      </w:r>
+    </w:p>
+    <w:p>
+      <w:pPr>
+        <w:rPr>
+          <w:lang w:val="fr-CH"/>
+        </w:rPr>
+      </w:pPr>
+      <w:r>
+        <w:rPr>
+          <w:lang w:val="fr-CH"/>
+        </w:rPr>
+        <w:t>-</w:t>
+      </w:r>
+      <w:r>
+        <w:rPr>
+          <w:lang w:val="fr-CH"/>
+        </w:rPr>
+        <w:tab/>
+        <w:t>Vue Router (équipe core). Vue Router Documentation. https://router.vuejs.org/. Consulté en mai 2026.</w:t>
+      </w:r>
+    </w:p>
+    <w:p>
+      <w:pPr>
+        <w:rPr>
+          <w:lang w:val="fr-CH"/>
+        </w:rPr>
+      </w:pPr>
+      <w:r>
+        <w:rPr>
+          <w:lang w:val="fr-CH"/>
+        </w:rPr>
+        <w:t>-</w:t>
+      </w:r>
+      <w:r>
+        <w:rPr>
+          <w:lang w:val="fr-CH"/>
+        </w:rPr>
+        <w:tab/>
+        <w:t>Strongloop / IBM. Express.js Documentation — Guide. https://expressjs.com/en/guide/routing.html. Consulté en mai 2026.</w:t>
+      </w:r>
+    </w:p>
+    <w:p>
+      <w:pPr>
+        <w:rPr>
+          <w:lang w:val="fr-CH"/>
+        </w:rPr>
+      </w:pPr>
+      <w:r>
+        <w:rPr>
+          <w:lang w:val="fr-CH"/>
+        </w:rPr>
+        <w:t>-</w:t>
+      </w:r>
+      <w:r>
+        <w:rPr>
+          <w:lang w:val="fr-CH"/>
+        </w:rPr>
+        <w:tab/>
+        <w:t>MariaDB Foundation. MariaDB Server Documentation — Knowledge Base. https://mariadb.com/kb/en/documentation/. Consulté en mai 2026.</w:t>
+      </w:r>
+    </w:p>
+    <w:p>
+      <w:r>
+        <w:rPr>
+          <w:lang w:val="fr-CH"/>
+        </w:rPr>
+        <w:t>-</w:t>
+      </w:r>
+      <w:r>
+        <w:rPr>
+          <w:lang w:val="fr-CH"/>
+        </w:rPr>
+        <w:tab/>
+        <w:t xml:space="preserve">MariaDB Foundation. mariadb (driver Node.js) — Promise API. https://mariadb.com/kb/en/promise-api/. </w:t>
+      </w:r>
+      <w:r>
+        <w:t>Consulté en mai 2026.</w:t>
+      </w:r>
+    </w:p>
+    <w:p>
+      <w:pPr>
+        <w:pStyle w:val="Titre4"/>
+        <w:rPr>
+          <w:lang w:val="fr-CH"/>
+        </w:rPr>
+      </w:pPr>
+      <w:r>
+        <w:rPr>
+          <w:lang w:val="fr-CH"/>
+        </w:rPr>
+        <w:t>Outils de build, qualité et tests</w:t>
+      </w:r>
+    </w:p>
+    <w:p>
+      <w:pPr>
+        <w:rPr>
+          <w:lang w:val="fr-CH"/>
+        </w:rPr>
+      </w:pPr>
+      <w:r>
+        <w:rPr>
+          <w:lang w:val="fr-CH"/>
+        </w:rPr>
+        <w:t>-</w:t>
+      </w:r>
+      <w:r>
+        <w:rPr>
+          <w:lang w:val="fr-CH"/>
+        </w:rPr>
+        <w:tab/>
+        <w:t>Yuxi (Evan) You. Vite — Next Generation Frontend Tooling. https://vitejs.dev/guide/. Consulté en mai 2026.</w:t>
+      </w:r>
+    </w:p>
+    <w:p>
+      <w:pPr>
+        <w:rPr>
+          <w:lang w:val="fr-CH"/>
+        </w:rPr>
+      </w:pPr>
+      <w:r>
+        <w:rPr>
+          <w:lang w:val="fr-CH"/>
+        </w:rPr>
+        <w:t>-</w:t>
+      </w:r>
+      <w:r>
+        <w:rPr>
+          <w:lang w:val="fr-CH"/>
+        </w:rPr>
+        <w:tab/>
+        <w:t>Tailwind Labs. Tailwind CSS Documentation. https://tailwindcss.com/docs. Consulté en mai 2026.</w:t>
+      </w:r>
+    </w:p>
+    <w:p>
+      <w:pPr>
+        <w:rPr>
+          <w:lang w:val="fr-CH"/>
+        </w:rPr>
+      </w:pPr>
+      <w:r>
+        <w:rPr>
+          <w:lang w:val="fr-CH"/>
+        </w:rPr>
+        <w:t>-</w:t>
+      </w:r>
+      <w:r>
+        <w:rPr>
+          <w:lang w:val="fr-CH"/>
+        </w:rPr>
+        <w:tab/>
+        <w:t>Biome team. Biome — One toolchain for your web project. https://biomejs.dev/. Consulté en mai 2026.</w:t>
+      </w:r>
+    </w:p>
+    <w:p>
+      <w:pPr>
+        <w:rPr>
+          <w:lang w:val="fr-CH"/>
+        </w:rPr>
+      </w:pPr>
+      <w:r>
+        <w:rPr>
+          <w:lang w:val="fr-CH"/>
+        </w:rPr>
+        <w:t>-</w:t>
+      </w:r>
+      <w:r>
+        <w:rPr>
+          <w:lang w:val="fr-CH"/>
+        </w:rPr>
+        <w:tab/>
+        <w:t>Microsoft Playwright Team. Playwright — Reliable end-to-end testing for modern web apps. https://playwright.dev/docs/intro. Consulté en mai 2026.</w:t>
+      </w:r>
+    </w:p>
+    <w:p>
+      <w:pPr>
+        <w:rPr>
+          <w:lang w:val="fr-CH"/>
+        </w:rPr>
+      </w:pPr>
+      <w:r>
+        <w:rPr>
+          <w:lang w:val="fr-CH"/>
+        </w:rPr>
+        <w:t>-</w:t>
+      </w:r>
+      <w:r>
+        <w:rPr>
+          <w:lang w:val="fr-CH"/>
+        </w:rPr>
+        <w:tab/>
+        <w:t>Postman Inc. Postman Learning Center — Writing tests. https://learning.postman.com/docs/writing-scripts/test-scripts/. Consulté en mai 2026.</w:t>
+      </w:r>
+    </w:p>
+    <w:p>
+      <w:r>
+        <w:rPr>
+          <w:lang w:val="fr-CH"/>
+        </w:rPr>
+        <w:t>-</w:t>
+      </w:r>
+      <w:r>
+        <w:rPr>
+          <w:lang w:val="fr-CH"/>
+        </w:rPr>
+        <w:tab/>
+        <w:t xml:space="preserve">Postman Inc. Newman — Command-line companion for Postman. https://github.com/postmanlabs/newman. </w:t>
+      </w:r>
+      <w:r>
+        <w:t>Consulté en mai 2026.</w:t>
+      </w:r>
+    </w:p>
+    <w:p>
+      <w:pPr>
+        <w:pStyle w:val="Titre4"/>
+      </w:pPr>
+      <w:r>
+        <w:t>Bibliothèques backend et middleware</w:t>
+      </w:r>
+    </w:p>
+    <w:p>
+      <w:pPr>
+        <w:rPr>
+          <w:lang w:val="fr-CH"/>
+        </w:rPr>
+      </w:pPr>
+      <w:r>
+        <w:rPr>
+          <w:lang w:val="fr-CH"/>
+        </w:rPr>
+        <w:t>-</w:t>
+      </w:r>
+      <w:r>
+        <w:rPr>
+          <w:lang w:val="fr-CH"/>
+        </w:rPr>
+        <w:tab/>
+        <w:t>Ideolys SAS. Carbone — Documentation officielle. https://carbone.io/documentation.html. Consulté en mai 2026.</w:t>
+      </w:r>
+    </w:p>
+    <w:p>
+      <w:pPr>
+        <w:rPr>
+          <w:lang w:val="fr-CH"/>
+        </w:rPr>
+      </w:pPr>
+      <w:r>
+        <w:rPr>
+          <w:lang w:val="fr-CH"/>
+        </w:rPr>
+        <w:t>-</w:t>
+      </w:r>
+      <w:r>
+        <w:rPr>
+          <w:lang w:val="fr-CH"/>
+        </w:rPr>
+        <w:tab/>
+        <w:t>Ideolys SAS. Carbone — Loops, conditions, formatters. https://carbone.io/api-reference.html. Consulté en mai 2026.</w:t>
+      </w:r>
+    </w:p>
+    <w:p>
+      <w:pPr>
+        <w:rPr>
+          <w:lang w:val="fr-CH"/>
+        </w:rPr>
+      </w:pPr>
+      <w:r>
+        <w:t>-</w:t>
+      </w:r>
+      <w:r>
+        <w:tab/>
+        <w:t xml:space="preserve">Express team. multer — Node.js middleware for handling multipart/form-data. https://github.com/expressjs/multer. </w:t>
+      </w:r>
+      <w:r>
+        <w:rPr>
+          <w:lang w:val="fr-CH"/>
+        </w:rPr>
+        <w:t>Consulté en mai 2026.</w:t>
+      </w:r>
+    </w:p>
+    <w:p>
+      <w:pPr>
+        <w:rPr>
+          <w:lang w:val="fr-CH"/>
+        </w:rPr>
+      </w:pPr>
+      <w:r>
+        <w:rPr>
+          <w:lang w:val="fr-CH"/>
+        </w:rPr>
+        <w:t>-</w:t>
+      </w:r>
+      <w:r>
+        <w:rPr>
+          <w:lang w:val="fr-CH"/>
+        </w:rPr>
+        <w:tab/>
+        <w:t>winstonjs. winston — A logger for just about everything. https://github.com/winstonjs/winston. Consulté en mai 2026.</w:t>
+      </w:r>
+    </w:p>
+    <w:p>
+      <w:pPr>
+        <w:rPr>
+          <w:lang w:val="fr-CH"/>
+        </w:rPr>
+      </w:pPr>
+      <w:r>
+        <w:rPr>
+          <w:lang w:val="fr-CH"/>
+        </w:rPr>
+        <w:t>-</w:t>
+      </w:r>
+      <w:r>
+        <w:rPr>
+          <w:lang w:val="fr-CH"/>
+        </w:rPr>
+        <w:tab/>
+        <w:t>date-fns team. date-fns — Modern JavaScript date utility library. https://date-fns.org/docs/Getting-Started. Consulté en mai 2026.</w:t>
+      </w:r>
+    </w:p>
+    <w:p>
+      <w:pPr>
+        <w:rPr>
+          <w:lang w:val="fr-CH"/>
+        </w:rPr>
+      </w:pPr>
+      <w:r>
+        <w:rPr>
+          <w:lang w:val="fr-CH"/>
+        </w:rPr>
+        <w:t>-</w:t>
+      </w:r>
+      <w:r>
+        <w:rPr>
+          <w:lang w:val="fr-CH"/>
+        </w:rPr>
+        <w:tab/>
+        <w:t>The Document Foundation. LibreOffice 7.x — Headless mode and command-line conversion. https://help.libreoffice.org/latest/en-US/text/shared/guide/start_parameters.html. Consulté en mai 2026.</w:t>
+      </w:r>
+    </w:p>
+    <w:p>
+      <w:pPr>
+        <w:pStyle w:val="Titre4"/>
+      </w:pPr>
+      <w:r>
+        <w:t>Conteneurisation et déploiement</w:t>
+      </w:r>
+    </w:p>
+    <w:p>
+      <w:pPr>
+        <w:rPr>
+          <w:lang w:val="fr-CH"/>
+        </w:rPr>
+      </w:pPr>
+      <w:r>
+        <w:rPr>
+          <w:lang w:val="fr-CH"/>
+        </w:rPr>
+        <w:t>-</w:t>
+      </w:r>
+      <w:r>
+        <w:rPr>
+          <w:lang w:val="fr-CH"/>
+        </w:rPr>
+        <w:tab/>
+        <w:t>Docker Inc. Docker Documentation. https://docs.docker.com/. Consulté en mai 2026.</w:t>
+      </w:r>
+    </w:p>
+    <w:p>
+      <w:pPr>
+        <w:rPr>
+          <w:lang w:val="fr-CH"/>
+        </w:rPr>
+      </w:pPr>
+      <w:r>
+        <w:rPr>
+          <w:lang w:val="fr-CH"/>
+        </w:rPr>
+        <w:lastRenderedPageBreak/>
+        <w:t>-</w:t>
+      </w:r>
+      <w:r>
+        <w:rPr>
+          <w:lang w:val="fr-CH"/>
+        </w:rPr>
+        <w:tab/>
+        <w:t>Docker Inc. Compose specification. https://docs.docker.com/compose/compose-file/. Consulté en mai 2026.</w:t>
+      </w:r>
+    </w:p>
+    <w:p>
+      <w:pPr>
+        <w:rPr>
+          <w:lang w:val="fr-CH"/>
+        </w:rPr>
+      </w:pPr>
+      <w:r>
+        <w:rPr>
+          <w:lang w:val="fr-CH"/>
+        </w:rPr>
+        <w:t>-</w:t>
+      </w:r>
+      <w:r>
+        <w:rPr>
+          <w:lang w:val="fr-CH"/>
+        </w:rPr>
+        <w:tab/>
+        <w:t>Alpine Linux team. apk-tools / Alpine package management. https://wiki.alpinelinux.org/wiki/Alpine_Linux_package_management. Consulté en mai 2026.</w:t>
+      </w:r>
+    </w:p>
+    <w:p>
+      <w:r>
+        <w:rPr>
+          <w:lang w:val="fr-CH"/>
+        </w:rPr>
+        <w:t>-</w:t>
+      </w:r>
+      <w:r>
+        <w:rPr>
+          <w:lang w:val="fr-CH"/>
+        </w:rPr>
+        <w:tab/>
+        <w:t xml:space="preserve">Nginx Inc. Nginx — try_files directive (SPA fallback). https://nginx.org/en/docs/http/ngx_http_core_module.html#try_files. </w:t>
+      </w:r>
+      <w:r>
+        <w:t>Consulté en mai 2026.</w:t>
+      </w:r>
+    </w:p>
+    <w:p>
+      <w:pPr>
+        <w:pStyle w:val="Titre4"/>
+      </w:pPr>
+      <w:r>
+        <w:t>Normes et standards</w:t>
+      </w:r>
+    </w:p>
+    <w:p>
+      <w:pPr>
+        <w:rPr>
+          <w:lang w:val="fr-CH"/>
+        </w:rPr>
+      </w:pPr>
+      <w:r>
+        <w:rPr>
+          <w:lang w:val="fr-CH"/>
+        </w:rPr>
+        <w:t>-</w:t>
+      </w:r>
+      <w:r>
+        <w:rPr>
+          <w:lang w:val="fr-CH"/>
+        </w:rPr>
+        <w:tab/>
+        <w:t>OpenAPI Initiative. OpenAPI Specification 3.0.3. https://spec.openapis.org/oas/v3.0.3. Consulté en mai 2026.</w:t>
+      </w:r>
+    </w:p>
+    <w:p>
+      <w:pPr>
+        <w:rPr>
+          <w:lang w:val="fr-CH"/>
+        </w:rPr>
+      </w:pPr>
+      <w:r>
+        <w:rPr>
+          <w:lang w:val="fr-CH"/>
+        </w:rPr>
+        <w:t>-</w:t>
+      </w:r>
+      <w:r>
+        <w:rPr>
+          <w:lang w:val="fr-CH"/>
+        </w:rPr>
+        <w:tab/>
+        <w:t>Fielding, R. T. (2000). Architectural Styles and the Design of Network-based Software Architectures. Thèse de doctorat, University of California, Irvine. https://www.ics.uci.edu/~fielding/pubs/dissertation/top.htm. — Définition originale de REST, base architecturale de l'API.</w:t>
+      </w:r>
+    </w:p>
+    <w:p>
+      <w:pPr>
+        <w:rPr>
+          <w:lang w:val="fr-CH"/>
+        </w:rPr>
+      </w:pPr>
+      <w:r>
+        <w:rPr>
+          <w:lang w:val="fr-CH"/>
+        </w:rPr>
+        <w:t>-</w:t>
+      </w:r>
+      <w:r>
+        <w:rPr>
+          <w:lang w:val="fr-CH"/>
+        </w:rPr>
+        <w:tab/>
+        <w:t>IETF. RFC 9110 — HTTP Semantics. https://www.rfc-editor.org/rfc/rfc9110.html. Consulté en mai 2026. — Codes de statut HTTP utilisés (200, 201, 204, 400, 404, 409, 422, 500, 503).</w:t>
+      </w:r>
+    </w:p>
+    <w:p>
+      <w:pPr>
+        <w:rPr>
+          <w:lang w:val="fr-CH"/>
+        </w:rPr>
+      </w:pPr>
+      <w:r>
+        <w:rPr>
+          <w:lang w:val="fr-CH"/>
+        </w:rPr>
+        <w:t>-</w:t>
+      </w:r>
+      <w:r>
+        <w:rPr>
+          <w:lang w:val="fr-CH"/>
+        </w:rPr>
+        <w:tab/>
+        <w:t>OWASP Foundation. OWASP Top Ten 2021. https://owasp.org/Top10/. Consulté en mai 2026. — Référence pour les mesures contre injections SQL, XSS et path traversal.</w:t>
+      </w:r>
+    </w:p>
+    <w:p>
+      <w:pPr>
+        <w:rPr>
+          <w:lang w:val="fr-CH"/>
+        </w:rPr>
+      </w:pPr>
+      <w:r>
+        <w:rPr>
+          <w:lang w:val="fr-CH"/>
+        </w:rPr>
+        <w:t>-</w:t>
+      </w:r>
+      <w:r>
+        <w:rPr>
+          <w:lang w:val="fr-CH"/>
+        </w:rPr>
+        <w:tab/>
+        <w:t>OWASP Foundation. SQL Injection Prevention Cheat Sheet. https://cheatsheetseries.owasp.org/cheatsheets/SQL_Injection_Prevention_Cheat_Sheet.html. Consulté en mai 2026.</w:t>
+      </w:r>
+    </w:p>
+    <w:p>
+      <w:r>
+        <w:rPr>
+          <w:lang w:val="fr-CH"/>
+        </w:rPr>
+        <w:t>-</w:t>
+      </w:r>
+      <w:r>
+        <w:rPr>
+          <w:lang w:val="fr-CH"/>
+        </w:rPr>
+        <w:tab/>
+        <w:t xml:space="preserve">Préposé fédéral à la protection des données et à la transparence (PFPDT). Loi fédérale sur la protection des données (LPD). https://www.fedlex.admin.ch/eli/cc/2022/491/fr. </w:t>
+      </w:r>
+      <w:r>
+        <w:t>Version en vigueur au 1er septembre 2023. Consulté en mai 2026.</w:t>
+      </w:r>
+    </w:p>
+    <w:p>
+      <w:pPr>
+        <w:pStyle w:val="Titre4"/>
+      </w:pPr>
+      <w:r>
+        <w:t>Patterns techniques et bonnes pratiques</w:t>
+      </w:r>
+    </w:p>
+    <w:p>
+      <w:pPr>
+        <w:rPr>
+          <w:lang w:val="fr-CH"/>
+        </w:rPr>
+      </w:pPr>
+      <w:r>
+        <w:rPr>
+          <w:lang w:val="fr-CH"/>
+        </w:rPr>
+        <w:t>-</w:t>
+      </w:r>
+      <w:r>
+        <w:rPr>
+          <w:lang w:val="fr-CH"/>
+        </w:rPr>
+        <w:tab/>
+        <w:t>Node.js Foundation. util.promisify — Convertir un callback Node en Promise. https://nodejs.org/api/util.html#utilpromisifyoriginal. Consulté en mai 2026. — Utilisé pour generateCertificate.</w:t>
+      </w:r>
+    </w:p>
+    <w:p>
+      <w:pPr>
+        <w:rPr>
+          <w:lang w:val="fr-CH"/>
+        </w:rPr>
+      </w:pPr>
+      <w:r>
+        <w:rPr>
+          <w:lang w:val="fr-CH"/>
+        </w:rPr>
+        <w:t>-</w:t>
+      </w:r>
+      <w:r>
+        <w:rPr>
+          <w:lang w:val="fr-CH"/>
+        </w:rPr>
+        <w:tab/>
+        <w:t>MariaDB. Transactions and ACID. https://mariadb.com/kb/en/transactions/. Consulté en mai 2026. — Référence pour Activity.create / Activity.update.</w:t>
+      </w:r>
+    </w:p>
+    <w:p>
+      <w:pPr>
+        <w:rPr>
+          <w:lang w:val="fr-CH"/>
+        </w:rPr>
+      </w:pPr>
+      <w:r>
+        <w:rPr>
+          <w:lang w:val="fr-CH"/>
+        </w:rPr>
+        <w:t>-</w:t>
+      </w:r>
+      <w:r>
+        <w:rPr>
+          <w:lang w:val="fr-CH"/>
+        </w:rPr>
+        <w:tab/>
+        <w:t xml:space="preserve">MariaDB. </w:t>
+      </w:r>
+      <w:r>
+        <w:t xml:space="preserve">Foreign Keys and Referential Integrity. https://mariadb.com/kb/en/foreign-keys/. </w:t>
+      </w:r>
+      <w:r>
+        <w:rPr>
+          <w:lang w:val="fr-CH"/>
+        </w:rPr>
+        <w:t>Consulté en mai 2026.</w:t>
+      </w:r>
+    </w:p>
+    <w:p>
+      <w:pPr>
+        <w:rPr>
+          <w:lang w:val="fr-CH"/>
+        </w:rPr>
+      </w:pPr>
+      <w:r>
+        <w:rPr>
+          <w:lang w:val="fr-CH"/>
+        </w:rPr>
+        <w:t>-</w:t>
+      </w:r>
+      <w:r>
+        <w:rPr>
+          <w:lang w:val="fr-CH"/>
+        </w:rPr>
+        <w:tab/>
+        <w:t>MariaDB. GROUP_CONCAT() — Aggregate function. https://mariadb.com/kb/en/group_concat/. Consulté en mai 2026. — Utilisé dans Activity.getById pour bundler les catégories.</w:t>
+      </w:r>
+    </w:p>
+    <w:p>
+      <w:pPr>
+        <w:rPr>
+          <w:lang w:val="fr-CH"/>
+        </w:rPr>
+      </w:pPr>
+      <w:r>
+        <w:rPr>
+          <w:lang w:val="fr-CH"/>
+        </w:rPr>
+        <w:t>-</w:t>
+      </w:r>
+      <w:r>
+        <w:rPr>
+          <w:lang w:val="fr-CH"/>
+        </w:rPr>
+        <w:tab/>
+        <w:t>Vue.js Team. Reactivity API: Reference, including notes on Map / Set tracking. https://vuejs.org/api/reactivity-core.html. Consulté en mai 2026.</w:t>
+      </w:r>
+    </w:p>
+    <w:p>
+      <w:pPr>
+        <w:rPr>
+          <w:lang w:val="fr-CH"/>
+        </w:rPr>
+      </w:pPr>
+      <w:r>
+        <w:rPr>
+          <w:lang w:val="fr-CH"/>
+        </w:rPr>
+        <w:t>-</w:t>
+      </w:r>
+      <w:r>
+        <w:rPr>
+          <w:lang w:val="fr-CH"/>
+        </w:rPr>
+        <w:tab/>
+        <w:t>Beck, K. (2003). Test-Driven Development: By Example. Addison-Wesley. — Source d'inspiration pour l'approche test-après-module.</w:t>
+      </w:r>
+    </w:p>
+    <w:p>
+      <w:pPr>
+        <w:rPr>
+          <w:lang w:val="fr-CH"/>
+        </w:rPr>
+      </w:pPr>
+      <w:r>
+        <w:rPr>
+          <w:lang w:val="fr-CH"/>
+        </w:rPr>
+        <w:t>-</w:t>
+      </w:r>
+      <w:r>
+        <w:rPr>
+          <w:lang w:val="fr-CH"/>
+        </w:rPr>
+        <w:tab/>
+        <w:t>Fowler, M. (2002). Patterns of Enterprise Application Architecture. Addison-Wesley. — Référence pour le pattern Service Layer / Data Mapper.</w:t>
+      </w:r>
+    </w:p>
+    <w:p>
+      <w:pPr>
+        <w:pStyle w:val="Titre4"/>
+      </w:pPr>
+      <w:r>
+        <w:t>Ressources internes HEIA-FR</w:t>
+      </w:r>
+    </w:p>
+    <w:p>
+      <w:pPr>
+        <w:rPr>
+          <w:lang w:val="fr-CH"/>
+        </w:rPr>
+      </w:pPr>
+      <w:r>
+        <w:rPr>
+          <w:lang w:val="fr-CH"/>
+        </w:rPr>
+        <w:t>-</w:t>
+      </w:r>
+      <w:r>
+        <w:rPr>
+          <w:lang w:val="fr-CH"/>
+        </w:rPr>
+        <w:tab/>
+        <w:t>CA TIC, HEIA-FR. Conventions de codage et de VCS. https://api-ti.pages.forge.hefr.ch. Consulté en mai 2026.</w:t>
+      </w:r>
+    </w:p>
+    <w:p>
+      <w:pPr>
+        <w:rPr>
+          <w:lang w:val="fr-CH"/>
+        </w:rPr>
+      </w:pPr>
+      <w:r>
+        <w:rPr>
+          <w:lang w:val="fr-CH"/>
+        </w:rPr>
+        <w:t>-</w:t>
+      </w:r>
+      <w:r>
+        <w:rPr>
+          <w:lang w:val="fr-CH"/>
+        </w:rPr>
+        <w:tab/>
+        <w:t>Service informatique HES-SO//Fribourg. Politique de sauvegarde des données. https://sinfo.hefr.ch/fr/catalogue-de-services/securite-et-protection-des-donnees/sauvegarde-des-donnees/. Consulté en mai 2026.</w:t>
+      </w:r>
+    </w:p>
+    <w:p>
+      <w:pPr>
+        <w:rPr>
+          <w:lang w:val="fr-CH"/>
+        </w:rPr>
+      </w:pPr>
+      <w:r>
+        <w:rPr>
+          <w:lang w:val="fr-CH"/>
+        </w:rPr>
+        <w:t>-</w:t>
+      </w:r>
+      <w:r>
+        <w:rPr>
+          <w:lang w:val="fr-CH"/>
+        </w:rPr>
+        <w:tab/>
+        <w:t>GitLab HEIA-FR. Dépôt privé du projet (visibilité interne uniquement).</w:t>
+      </w:r>
+    </w:p>
+    <w:p>
+      <w:pPr>
+        <w:rPr>
+          <w:lang w:val="fr-CH"/>
+        </w:rPr>
+      </w:pPr>
+      <w:r>
+        <w:rPr>
+          <w:lang w:val="fr-CH"/>
+        </w:rPr>
+        <w:t>-</w:t>
+      </w:r>
+      <w:r>
+        <w:rPr>
+          <w:lang w:val="fr-CH"/>
+        </w:rPr>
+        <w:tab/>
+        <w:t>ICT-Berufsbildung Schweiz. Manuel ICT — Partie B : Documentation / rapport du TPI, édition 2024.</w:t>
+      </w:r>
+    </w:p>
+    <w:p>
+      <w:pPr>
+        <w:rPr>
+          <w:lang w:val="fr-CH"/>
+        </w:rPr>
+      </w:pPr>
+      <w:r>
+        <w:rPr>
+          <w:lang w:val="fr-CH"/>
+        </w:rPr>
+        <w:t>-</w:t>
+      </w:r>
+      <w:r>
+        <w:rPr>
+          <w:lang w:val="fr-CH"/>
+        </w:rPr>
+        <w:tab/>
+        <w:t>Ordonnance fédérale sur la formation professionnelle initiale d'informaticienne / informaticien CFC, OFFT. https://www.bvet.admin.ch. Consulté en mai 2026.</w:t>
+      </w:r>
+    </w:p>
+    <w:p>
+      <w:pPr>
+        <w:pStyle w:val="Titre4"/>
+      </w:pPr>
+      <w:r>
+        <w:lastRenderedPageBreak/>
+        <w:t>Outils de design et diagrammes</w:t>
+      </w:r>
+    </w:p>
+    <w:p>
+      <w:pPr>
+        <w:rPr>
+          <w:lang w:val="fr-CH"/>
+        </w:rPr>
+      </w:pPr>
+      <w:r>
+        <w:rPr>
+          <w:lang w:val="fr-CH"/>
+        </w:rPr>
+        <w:t>-</w:t>
+      </w:r>
+      <w:r>
+        <w:rPr>
+          <w:lang w:val="fr-CH"/>
+        </w:rPr>
+        <w:tab/>
+        <w:t>Pencil Project. Pencil — A GUI prototyping tool. https://pencil.evolus.vn/. Consulté en mai 2026.</w:t>
+      </w:r>
+    </w:p>
+    <w:p>
+      <w:pPr>
+        <w:rPr>
+          <w:lang w:val="fr-CH"/>
+        </w:rPr>
+      </w:pPr>
+      <w:r>
+        <w:rPr>
+          <w:lang w:val="fr-CH"/>
+        </w:rPr>
+        <w:t>-</w:t>
+      </w:r>
+      <w:r>
+        <w:rPr>
+          <w:lang w:val="fr-CH"/>
+        </w:rPr>
+        <w:tab/>
+        <w:t>Object Management Group (OMG). Unified Modeling Language Specification 2.5.1. https://www.omg.org/spec/UML/2.5.1/. Consulté en mai 2026.</w:t>
+      </w:r>
+    </w:p>
+    <w:p>
+      <w:pPr>
+        <w:rPr>
+          <w:lang w:val="fr-CH"/>
+        </w:rPr>
+      </w:pPr>
+      <w:r>
+        <w:rPr>
+          <w:lang w:val="fr-CH"/>
+        </w:rPr>
+        <w:t>-</w:t>
+      </w:r>
+      <w:r>
+        <w:rPr>
+          <w:lang w:val="fr-CH"/>
+        </w:rPr>
+        <w:tab/>
+        <w:t>Roques, A. PlantUML — Open-source tool to draw UML diagrams. https://plantuml.com/. Consulté en mai 2026.</w:t>
+      </w:r>
+    </w:p>
+    <w:p>
+      <w:pPr>
+        <w:rPr>
+          <w:lang w:val="fr-CH"/>
+        </w:rPr>
+      </w:pPr>
+      <w:r>
+        <w:rPr>
+          <w:lang w:val="fr-CH"/>
+        </w:rPr>
+        <w:t>-</w:t>
+      </w:r>
+      <w:r>
+        <w:rPr>
+          <w:lang w:val="fr-CH"/>
+        </w:rPr>
+        <w:tab/>
+        <w:t>Holistics. dbdiagram.io — Database relationship diagrams. https://dbdiagram.io/. Consulté en mai 2026.</w:t>
+      </w:r>
+    </w:p>
+    <w:p>
+      <w:r>
+        <w:rPr>
+          <w:lang w:val="fr-CH"/>
+        </w:rPr>
+        <w:t>-</w:t>
+      </w:r>
+      <w:r>
+        <w:rPr>
+          <w:lang w:val="fr-CH"/>
+        </w:rPr>
+        <w:tab/>
+        <w:t xml:space="preserve">JGraph Ltd. diagrams.net (anciennement Draw.io) — Diagrammes en ligne. https://www.drawio.com/. </w:t>
+      </w:r>
+      <w:r>
+        <w:t>Consulté en mai 2026.</w:t>
+      </w:r>
+    </w:p>
+    <w:p>
+      <w:pPr>
+        <w:pStyle w:val="Titre4"/>
+      </w:pPr>
+      <w:r>
+        <w:t>Outils d'assistance par intelligence artificielle</w:t>
+      </w:r>
+    </w:p>
+    <w:p>
+      <w:pPr>
+        <w:rPr>
+          <w:lang w:val="fr-CH"/>
+        </w:rPr>
+      </w:pPr>
       <w:bookmarkStart w:id="40" w:name="_Toc229059121"/>
       <w:bookmarkEnd w:id="40"/>
       <w:r>
-        <w:t>Cette bibliographie liste les sources utilisées pour la conception, le développement et la documentation du projet. Toutes les URL ont été consultées en mai 2026. Les références sont regroupées par catégorie : technologies imposées, outils, patterns techniques, normes / référentiels, ressources internes HEIA-FR.</w:t>
-      </w:r>
-    </w:p>
-    <w:p>
-      <w:pPr>
-        <w:pStyle w:val="Titre4"/>
-      </w:pPr>
-      <w:bookmarkStart w:id="40" w:name="_Toc229059121"/>
-      <w:bookmarkEnd w:id="40"/>
-      <w:r>
-        <w:t>Technologies imposées par le cahier des charges</w:t>
-      </w:r>
-    </w:p>
-    <w:p>
-      <w:pPr/>
-      <w:bookmarkStart w:id="40" w:name="_Toc229059121"/>
-      <w:bookmarkEnd w:id="40"/>
-      <w:r>
+        <w:rPr>
+          <w:lang w:val="fr-CH"/>
+        </w:rPr>
         <w:t>-</w:t>
-        <w:tab/>
-        <w:t>Vue.js (équipe core). Vue.js Documentation — Guide officiel. https://vuejs.org/guide/. Consulté en mai 2026.</w:t>
-      </w:r>
-    </w:p>
-    <w:p>
-      <w:pPr/>
-      <w:bookmarkStart w:id="40" w:name="_Toc229059121"/>
-      <w:bookmarkEnd w:id="40"/>
-      <w:r>
-        <w:t>-</w:t>
-        <w:tab/>
-        <w:t>Vue.js (équipe core). Composition API Reference. https://vuejs.org/api/composition-api-setup.html. Consulté en mai 2026.</w:t>
-      </w:r>
-    </w:p>
-    <w:p>
-      <w:pPr/>
-      <w:bookmarkStart w:id="40" w:name="_Toc229059121"/>
-      <w:bookmarkEnd w:id="40"/>
-      <w:r>
-        <w:t>-</w:t>
-        <w:tab/>
-        <w:t>Vue Router (équipe core). Vue Router Documentation. https://router.vuejs.org/. Consulté en mai 2026.</w:t>
-      </w:r>
-    </w:p>
-    <w:p>
-      <w:pPr/>
-      <w:bookmarkStart w:id="40" w:name="_Toc229059121"/>
-      <w:bookmarkEnd w:id="40"/>
-      <w:r>
-        <w:t>-</w:t>
-        <w:tab/>
-        <w:t>Strongloop / IBM. Express.js Documentation — Guide. https://expressjs.com/en/guide/routing.html. Consulté en mai 2026.</w:t>
-      </w:r>
-    </w:p>
-    <w:p>
-      <w:pPr/>
-      <w:bookmarkStart w:id="40" w:name="_Toc229059121"/>
-      <w:bookmarkEnd w:id="40"/>
-      <w:r>
-        <w:t>-</w:t>
-        <w:tab/>
-        <w:t>MariaDB Foundation. MariaDB Server Documentation — Knowledge Base. https://mariadb.com/kb/en/documentation/. Consulté en mai 2026.</w:t>
-      </w:r>
-    </w:p>
-    <w:p>
-      <w:pPr/>
-      <w:bookmarkStart w:id="40" w:name="_Toc229059121"/>
-      <w:bookmarkEnd w:id="40"/>
-      <w:r>
-        <w:t>-</w:t>
-        <w:tab/>
-        <w:t>MariaDB Foundation. mariadb (driver Node.js) — Promise API. https://mariadb.com/kb/en/promise-api/. Consulté en mai 2026.</w:t>
-      </w:r>
-    </w:p>
-    <w:p>
-      <w:pPr>
-        <w:pStyle w:val="Titre4"/>
-      </w:pPr>
-      <w:bookmarkStart w:id="40" w:name="_Toc229059121"/>
-      <w:bookmarkEnd w:id="40"/>
-      <w:r>
-        <w:t>Outils de build, qualité et tests</w:t>
-      </w:r>
-    </w:p>
-    <w:p>
-      <w:pPr/>
-      <w:bookmarkStart w:id="40" w:name="_Toc229059121"/>
-      <w:bookmarkEnd w:id="40"/>
-      <w:r>
-        <w:t>-</w:t>
-        <w:tab/>
-        <w:t>Yuxi (Evan) You. Vite — Next Generation Frontend Tooling. https://vitejs.dev/guide/. Consulté en mai 2026.</w:t>
-      </w:r>
-    </w:p>
-    <w:p>
-      <w:pPr/>
-      <w:bookmarkStart w:id="40" w:name="_Toc229059121"/>
-      <w:bookmarkEnd w:id="40"/>
-      <w:r>
-        <w:t>-</w:t>
-        <w:tab/>
-        <w:t>Tailwind Labs. Tailwind CSS Documentation. https://tailwindcss.com/docs. Consulté en mai 2026.</w:t>
-      </w:r>
-    </w:p>
-    <w:p>
-      <w:pPr/>
-      <w:bookmarkStart w:id="40" w:name="_Toc229059121"/>
-      <w:bookmarkEnd w:id="40"/>
-      <w:r>
-        <w:t>-</w:t>
-        <w:tab/>
-        <w:t>Biome team. Biome — One toolchain for your web project. https://biomejs.dev/. Consulté en mai 2026.</w:t>
-      </w:r>
-    </w:p>
-    <w:p>
-      <w:pPr/>
-      <w:bookmarkStart w:id="40" w:name="_Toc229059121"/>
-      <w:bookmarkEnd w:id="40"/>
-      <w:r>
-        <w:t>-</w:t>
-        <w:tab/>
-        <w:t>Microsoft Playwright Team. Playwright — Reliable end-to-end testing for modern web apps. https://playwright.dev/docs/intro. Consulté en mai 2026.</w:t>
-      </w:r>
-    </w:p>
-    <w:p>
-      <w:pPr/>
-      <w:bookmarkStart w:id="40" w:name="_Toc229059121"/>
-      <w:bookmarkEnd w:id="40"/>
-      <w:r>
-        <w:t>-</w:t>
-        <w:tab/>
-        <w:t>Postman Inc. Postman Learning Center — Writing tests. https://learning.postman.com/docs/writing-scripts/test-scripts/. Consulté en mai 2026.</w:t>
-      </w:r>
-    </w:p>
-    <w:p>
-      <w:pPr/>
-      <w:bookmarkStart w:id="40" w:name="_Toc229059121"/>
-      <w:bookmarkEnd w:id="40"/>
-      <w:r>
-        <w:t>-</w:t>
-        <w:tab/>
-        <w:t>Postman Inc. Newman — Command-line companion for Postman. https://github.com/postmanlabs/newman. Consulté en mai 2026.</w:t>
-      </w:r>
-    </w:p>
-    <w:p>
-      <w:pPr>
-        <w:pStyle w:val="Titre4"/>
-      </w:pPr>
-      <w:bookmarkStart w:id="40" w:name="_Toc229059121"/>
-      <w:bookmarkEnd w:id="40"/>
-      <w:r>
-        <w:t>Bibliothèques backend et middleware</w:t>
-      </w:r>
-    </w:p>
-    <w:p>
-      <w:pPr/>
-      <w:bookmarkStart w:id="40" w:name="_Toc229059121"/>
-      <w:bookmarkEnd w:id="40"/>
-      <w:r>
-        <w:t>-</w:t>
-        <w:tab/>
-        <w:t>Ideolys SAS. Carbone — Documentation officielle. https://carbone.io/documentation.html. Consulté en mai 2026.</w:t>
-      </w:r>
-    </w:p>
-    <w:p>
-      <w:pPr/>
-      <w:bookmarkStart w:id="40" w:name="_Toc229059121"/>
-      <w:bookmarkEnd w:id="40"/>
-      <w:r>
-        <w:t>-</w:t>
-        <w:tab/>
-        <w:t>Ideolys SAS. Carbone — Loops, conditions, formatters. https://carbone.io/api-reference.html. Consulté en mai 2026.</w:t>
-      </w:r>
-    </w:p>
-    <w:p>
-      <w:pPr/>
-      <w:bookmarkStart w:id="40" w:name="_Toc229059121"/>
-      <w:bookmarkEnd w:id="40"/>
-      <w:r>
-        <w:t>-</w:t>
-        <w:tab/>
-        <w:t>Express team. multer — Node.js middleware for handling multipart/form-data. https://github.com/expressjs/multer. Consulté en mai 2026.</w:t>
-      </w:r>
-    </w:p>
-    <w:p>
-      <w:pPr/>
-      <w:bookmarkStart w:id="40" w:name="_Toc229059121"/>
-      <w:bookmarkEnd w:id="40"/>
-      <w:r>
-        <w:t>-</w:t>
-        <w:tab/>
-        <w:t>winstonjs. winston — A logger for just about everything. https://github.com/winstonjs/winston. Consulté en mai 2026.</w:t>
-      </w:r>
-    </w:p>
-    <w:p>
-      <w:pPr/>
-      <w:bookmarkStart w:id="40" w:name="_Toc229059121"/>
-      <w:bookmarkEnd w:id="40"/>
-      <w:r>
-        <w:t>-</w:t>
-        <w:tab/>
-        <w:t>date-fns team. date-fns — Modern JavaScript date utility library. https://date-fns.org/docs/Getting-Started. Consulté en mai 2026.</w:t>
-      </w:r>
-    </w:p>
-    <w:p>
-      <w:pPr/>
-      <w:bookmarkStart w:id="40" w:name="_Toc229059121"/>
-      <w:bookmarkEnd w:id="40"/>
-      <w:r>
-        <w:t>-</w:t>
-        <w:tab/>
-        <w:t>The Document Foundation. LibreOffice 7.x — Headless mode and command-line conversion. https://help.libreoffice.org/latest/en-US/text/shared/guide/start_parameters.html. Consulté en mai 2026.</w:t>
-      </w:r>
-    </w:p>
-    <w:p>
-      <w:pPr>
-        <w:pStyle w:val="Titre4"/>
-      </w:pPr>
-      <w:bookmarkStart w:id="40" w:name="_Toc229059121"/>
-      <w:bookmarkEnd w:id="40"/>
-      <w:r>
-        <w:t>Conteneurisation et déploiement</w:t>
-      </w:r>
-    </w:p>
-    <w:p>
-      <w:pPr/>
-      <w:bookmarkStart w:id="40" w:name="_Toc229059121"/>
-      <w:bookmarkEnd w:id="40"/>
-      <w:r>
-        <w:t>-</w:t>
-        <w:tab/>
-        <w:t>Docker Inc. Docker Documentation. https://docs.docker.com/. Consulté en mai 2026.</w:t>
-      </w:r>
-    </w:p>
-    <w:p>
-      <w:pPr/>
-      <w:bookmarkStart w:id="40" w:name="_Toc229059121"/>
-      <w:bookmarkEnd w:id="40"/>
-      <w:r>
-        <w:t>-</w:t>
-        <w:tab/>
-        <w:t>Docker Inc. Compose specification. https://docs.docker.com/compose/compose-file/. Consulté en mai 2026.</w:t>
-      </w:r>
-    </w:p>
-    <w:p>
-      <w:pPr/>
-      <w:bookmarkStart w:id="40" w:name="_Toc229059121"/>
-      <w:bookmarkEnd w:id="40"/>
-      <w:r>
-        <w:t>-</w:t>
-        <w:tab/>
-        <w:t>Alpine Linux team. apk-tools / Alpine package management. https://wiki.alpinelinux.org/wiki/Alpine_Linux_package_management. Consulté en mai 2026.</w:t>
-      </w:r>
-    </w:p>
-    <w:p>
-      <w:pPr/>
-      <w:bookmarkStart w:id="40" w:name="_Toc229059121"/>
-      <w:bookmarkEnd w:id="40"/>
-      <w:r>
-        <w:t>-</w:t>
-        <w:tab/>
-        <w:t>Nginx Inc. Nginx — try_files directive (SPA fallback). https://nginx.org/en/docs/http/ngx_http_core_module.html#try_files. Consulté en mai 2026.</w:t>
-      </w:r>
-    </w:p>
-    <w:p>
-      <w:pPr>
-        <w:pStyle w:val="Titre4"/>
-      </w:pPr>
-      <w:bookmarkStart w:id="40" w:name="_Toc229059121"/>
-      <w:bookmarkEnd w:id="40"/>
-      <w:r>
-        <w:t>Normes et standards</w:t>
-      </w:r>
-    </w:p>
-    <w:p>
-      <w:pPr/>
-      <w:bookmarkStart w:id="40" w:name="_Toc229059121"/>
-      <w:bookmarkEnd w:id="40"/>
-      <w:r>
-        <w:t>-</w:t>
-        <w:tab/>
-        <w:t>OpenAPI Initiative. OpenAPI Specification 3.0.3. https://spec.openapis.org/oas/v3.0.3. Consulté en mai 2026.</w:t>
-      </w:r>
-    </w:p>
-    <w:p>
-      <w:pPr/>
-      <w:bookmarkStart w:id="40" w:name="_Toc229059121"/>
-      <w:bookmarkEnd w:id="40"/>
-      <w:r>
-        <w:t>-</w:t>
-        <w:tab/>
-        <w:t>Fielding, R. T. (2000). Architectural Styles and the Design of Network-based Software Architectures. Thèse de doctorat, University of California, Irvine. https://www.ics.uci.edu/~fielding/pubs/dissertation/top.htm. — Définition originale de REST, base architecturale de l'API.</w:t>
-      </w:r>
-    </w:p>
-    <w:p>
-      <w:pPr/>
-      <w:bookmarkStart w:id="40" w:name="_Toc229059121"/>
-      <w:bookmarkEnd w:id="40"/>
-      <w:r>
-        <w:t>-</w:t>
-        <w:tab/>
-        <w:t>IETF. RFC 9110 — HTTP Semantics. https://www.rfc-editor.org/rfc/rfc9110.html. Consulté en mai 2026. — Codes de statut HTTP utilisés (200, 201, 204, 400, 404, 409, 422, 500, 503).</w:t>
-      </w:r>
-    </w:p>
-    <w:p>
-      <w:pPr/>
-      <w:bookmarkStart w:id="40" w:name="_Toc229059121"/>
-      <w:bookmarkEnd w:id="40"/>
-      <w:r>
-        <w:t>-</w:t>
-        <w:tab/>
-        <w:t>OWASP Foundation. OWASP Top Ten 2021. https://owasp.org/Top10/. Consulté en mai 2026. — Référence pour les mesures contre injections SQL, XSS et path traversal.</w:t>
-      </w:r>
-    </w:p>
-    <w:p>
-      <w:pPr/>
-      <w:bookmarkStart w:id="40" w:name="_Toc229059121"/>
-      <w:bookmarkEnd w:id="40"/>
-      <w:r>
-        <w:t>-</w:t>
-        <w:tab/>
-        <w:t>OWASP Foundation. SQL Injection Prevention Cheat Sheet. https://cheatsheetseries.owasp.org/cheatsheets/SQL_Injection_Prevention_Cheat_Sheet.html. Consulté en mai 2026.</w:t>
-      </w:r>
-    </w:p>
-    <w:p>
-      <w:pPr/>
-      <w:bookmarkStart w:id="40" w:name="_Toc229059121"/>
-      <w:bookmarkEnd w:id="40"/>
-      <w:r>
-        <w:t>-</w:t>
-        <w:tab/>
-        <w:t>Préposé fédéral à la protection des données et à la transparence (PFPDT). Loi fédérale sur la protection des données (LPD). https://www.fedlex.admin.ch/eli/cc/2022/491/fr. Version en vigueur au 1er septembre 2023. Consulté en mai 2026.</w:t>
-      </w:r>
-    </w:p>
-    <w:p>
-      <w:pPr>
-        <w:pStyle w:val="Titre4"/>
-      </w:pPr>
-      <w:bookmarkStart w:id="40" w:name="_Toc229059121"/>
-      <w:bookmarkEnd w:id="40"/>
-      <w:r>
-        <w:t>Patterns techniques et bonnes pratiques</w:t>
-      </w:r>
-    </w:p>
-    <w:p>
-      <w:pPr/>
-      <w:bookmarkStart w:id="40" w:name="_Toc229059121"/>
-      <w:bookmarkEnd w:id="40"/>
-      <w:r>
-        <w:t>-</w:t>
-        <w:tab/>
-        <w:t>Node.js Foundation. util.promisify — Convertir un callback Node en Promise. https://nodejs.org/api/util.html#utilpromisifyoriginal. Consulté en mai 2026. — Utilisé pour generateCertificate.</w:t>
-      </w:r>
-    </w:p>
-    <w:p>
-      <w:pPr/>
-      <w:bookmarkStart w:id="40" w:name="_Toc229059121"/>
-      <w:bookmarkEnd w:id="40"/>
-      <w:r>
-        <w:t>-</w:t>
-        <w:tab/>
-        <w:t>MariaDB. Transactions and ACID. https://mariadb.com/kb/en/transactions/. Consulté en mai 2026. — Référence pour Activity.create / Activity.update.</w:t>
-      </w:r>
-    </w:p>
-    <w:p>
-      <w:pPr/>
-      <w:bookmarkStart w:id="40" w:name="_Toc229059121"/>
-      <w:bookmarkEnd w:id="40"/>
-      <w:r>
-        <w:t>-</w:t>
-        <w:tab/>
-        <w:t>MariaDB. Foreign Keys and Referential Integrity. https://mariadb.com/kb/en/foreign-keys/. Consulté en mai 2026.</w:t>
-      </w:r>
-    </w:p>
-    <w:p>
-      <w:pPr/>
-      <w:bookmarkStart w:id="40" w:name="_Toc229059121"/>
-      <w:bookmarkEnd w:id="40"/>
-      <w:r>
-        <w:t>-</w:t>
-        <w:tab/>
-        <w:t>MariaDB. GROUP_CONCAT() — Aggregate function. https://mariadb.com/kb/en/group_concat/. Consulté en mai 2026. — Utilisé dans Activity.getById pour bundler les catégories.</w:t>
-      </w:r>
-    </w:p>
-    <w:p>
-      <w:pPr/>
-      <w:bookmarkStart w:id="40" w:name="_Toc229059121"/>
-      <w:bookmarkEnd w:id="40"/>
-      <w:r>
-        <w:t>-</w:t>
-        <w:tab/>
-        <w:t>Vue.js Team. Reactivity API: Reference, including notes on Map / Set tracking. https://vuejs.org/api/reactivity-core.html. Consulté en mai 2026.</w:t>
-      </w:r>
-    </w:p>
-    <w:p>
-      <w:pPr/>
-      <w:bookmarkStart w:id="40" w:name="_Toc229059121"/>
-      <w:bookmarkEnd w:id="40"/>
-      <w:r>
-        <w:t>-</w:t>
-        <w:tab/>
-        <w:t>Beck, K. (2003). Test-Driven Development: By Example. Addison-Wesley. — Source d'inspiration pour l'approche test-après-module.</w:t>
-      </w:r>
-    </w:p>
-    <w:p>
-      <w:pPr/>
-      <w:bookmarkStart w:id="40" w:name="_Toc229059121"/>
-      <w:bookmarkEnd w:id="40"/>
-      <w:r>
-        <w:t>-</w:t>
-        <w:tab/>
-        <w:t>Fowler, M. (2002). Patterns of Enterprise Application Architecture. Addison-Wesley. — Référence pour le pattern Service Layer / Data Mapper.</w:t>
-      </w:r>
-    </w:p>
-    <w:p>
-      <w:pPr>
-        <w:pStyle w:val="Titre4"/>
-      </w:pPr>
-      <w:bookmarkStart w:id="40" w:name="_Toc229059121"/>
-      <w:bookmarkEnd w:id="40"/>
-      <w:r>
-        <w:t>Ressources internes HEIA-FR</w:t>
-      </w:r>
-    </w:p>
-    <w:p>
-      <w:pPr/>
-      <w:bookmarkStart w:id="40" w:name="_Toc229059121"/>
-      <w:bookmarkEnd w:id="40"/>
-      <w:r>
-        <w:t>-</w:t>
-        <w:tab/>
-        <w:t>CA TIC, HEIA-FR. Conventions de codage et de VCS. https://api-ti.pages.forge.hefr.ch. Consulté en mai 2026.</w:t>
-      </w:r>
-    </w:p>
-    <w:p>
-      <w:pPr/>
-      <w:bookmarkStart w:id="40" w:name="_Toc229059121"/>
-      <w:bookmarkEnd w:id="40"/>
-      <w:r>
-        <w:t>-</w:t>
-        <w:tab/>
-        <w:t>Service informatique HES-SO//Fribourg. Politique de sauvegarde des données. https://sinfo.hefr.ch/fr/catalogue-de-services/securite-et-protection-des-donnees/sauvegarde-des-donnees/. Consulté en mai 2026.</w:t>
-      </w:r>
-    </w:p>
-    <w:p>
-      <w:pPr/>
-      <w:bookmarkStart w:id="40" w:name="_Toc229059121"/>
-      <w:bookmarkEnd w:id="40"/>
-      <w:r>
-        <w:t>-</w:t>
-        <w:tab/>
-        <w:t>GitLab HEIA-FR. Dépôt privé du projet (visibilité interne uniquement).</w:t>
-      </w:r>
-    </w:p>
-    <w:p>
-      <w:pPr/>
-      <w:bookmarkStart w:id="40" w:name="_Toc229059121"/>
-      <w:bookmarkEnd w:id="40"/>
-      <w:r>
-        <w:t>-</w:t>
-        <w:tab/>
-        <w:t>ICT-Berufsbildung Schweiz. Manuel ICT — Partie B : Documentation / rapport du TPI, édition 2024.</w:t>
-      </w:r>
-    </w:p>
-    <w:p>
-      <w:pPr/>
-      <w:bookmarkStart w:id="40" w:name="_Toc229059121"/>
-      <w:bookmarkEnd w:id="40"/>
-      <w:r>
-        <w:t>-</w:t>
-        <w:tab/>
-        <w:t>Ordonnance fédérale sur la formation professionnelle initiale d'informaticienne / informaticien CFC, OFFT. https://www.bvet.admin.ch. Consulté en mai 2026.</w:t>
-      </w:r>
-    </w:p>
-    <w:p>
-      <w:pPr>
-        <w:pStyle w:val="Titre4"/>
-      </w:pPr>
-      <w:bookmarkStart w:id="40" w:name="_Toc229059121"/>
-      <w:bookmarkEnd w:id="40"/>
-      <w:r>
-        <w:t>Outils de design et diagrammes</w:t>
-      </w:r>
-    </w:p>
-    <w:p>
-      <w:pPr/>
-      <w:bookmarkStart w:id="40" w:name="_Toc229059121"/>
-      <w:bookmarkEnd w:id="40"/>
-      <w:r>
-        <w:t>-</w:t>
-        <w:tab/>
-        <w:t>Pencil Project. Pencil — A GUI prototyping tool. https://pencil.evolus.vn/. Consulté en mai 2026.</w:t>
-      </w:r>
-    </w:p>
-    <w:p>
-      <w:pPr/>
-      <w:bookmarkStart w:id="40" w:name="_Toc229059121"/>
-      <w:bookmarkEnd w:id="40"/>
-      <w:r>
-        <w:t>-</w:t>
-        <w:tab/>
-        <w:t>Object Management Group (OMG). Unified Modeling Language Specification 2.5.1. https://www.omg.org/spec/UML/2.5.1/. Consulté en mai 2026.</w:t>
-      </w:r>
-    </w:p>
-    <w:p>
-      <w:pPr/>
-      <w:bookmarkStart w:id="40" w:name="_Toc229059121"/>
-      <w:bookmarkEnd w:id="40"/>
-      <w:r>
-        <w:t>-</w:t>
-        <w:tab/>
-        <w:t>Roques, A. PlantUML — Open-source tool to draw UML diagrams. https://plantuml.com/. Consulté en mai 2026.</w:t>
-      </w:r>
-    </w:p>
-    <w:p>
-      <w:pPr/>
-      <w:bookmarkStart w:id="40" w:name="_Toc229059121"/>
-      <w:bookmarkEnd w:id="40"/>
-      <w:r>
-        <w:t>-</w:t>
-        <w:tab/>
-        <w:t>Holistics. dbdiagram.io — Database relationship diagrams. https://dbdiagram.io/. Consulté en mai 2026.</w:t>
-      </w:r>
-    </w:p>
-    <w:p>
-      <w:pPr/>
-      <w:bookmarkStart w:id="40" w:name="_Toc229059121"/>
-      <w:bookmarkEnd w:id="40"/>
-      <w:r>
-        <w:t>-</w:t>
-        <w:tab/>
-        <w:t>JGraph Ltd. diagrams.net (anciennement Draw.io) — Diagrammes en ligne. https://www.drawio.com/. Consulté en mai 2026.</w:t>
-      </w:r>
-    </w:p>
-    <w:p>
-      <w:pPr>
-        <w:pStyle w:val="Titre4"/>
-      </w:pPr>
-      <w:bookmarkStart w:id="40" w:name="_Toc229059121"/>
-      <w:bookmarkEnd w:id="40"/>
-      <w:r>
-        <w:t>Outils d'assistance par intelligence artificielle</w:t>
-      </w:r>
-    </w:p>
-    <w:p>
-      <w:pPr/>
-      <w:bookmarkStart w:id="40" w:name="_Toc229059121"/>
-      <w:bookmarkEnd w:id="40"/>
-      <w:r>
-        <w:t>-</w:t>
+      </w:r>
+      <w:r>
+        <w:rPr>
+          <w:lang w:val="fr-CH"/>
+        </w:rPr>
         <w:tab/>
         <w:t>Anthropic. Claude Code — CLI for AI-assisted software engineering. https://docs.anthropic.com/claude-code. Consulté en mai 2026. — Utilisé comme assistant rédactionnel et pour la génération de scaffolds de tests, conformément à la déclaration §2.5.</w:t>
       </w:r>
@@ -15813,11 +16641,6 @@
           <w:lang w:val="fr-CH"/>
         </w:rPr>
         <w:tab/>
-      </w:r>
-      <w:r>
-        <w:rPr>
-          <w:lang w:val="fr-CH"/>
-        </w:rPr>
         <w:t>Figure 4 — Diagramme de cas d'utilisation (§4.4.1)</w:t>
       </w:r>
     </w:p>
@@ -15878,11 +16701,6 @@
           <w:lang w:val="fr-CH"/>
         </w:rPr>
         <w:tab/>
-      </w:r>
-      <w:r>
-        <w:rPr>
-          <w:lang w:val="fr-CH"/>
-        </w:rPr>
         <w:t>Figure 7 — Ébauche : liste des ateliers (carte dépliée) (§4.6)</w:t>
       </w:r>
     </w:p>
@@ -16141,7 +16959,6 @@
                 <w:dataBinding w:prefixMappings="xmlns:ns0='http://purl.org/dc/elements/1.1/' xmlns:ns1='http://schemas.openxmlformats.org/package/2006/metadata/core-properties' " w:xpath="/ns1:coreProperties[1]/ns0:creator[1]" w:storeItemID="{6C3C8BC8-F283-45AE-878A-BAB7291924A1}"/>
                 <w:text/>
               </w:sdtPr>
-              <w:sdtEndPr/>
               <w:sdtContent>
                 <w:tc>
                   <w:tcPr>
@@ -16306,7 +17123,7 @@
                   <w:rPr>
                     <w:lang w:val="fr-CH"/>
                   </w:rPr>
-                  <w:t>07.05.2026 13:43</w:t>
+                  <w:t>08.05.2026 07:48</w:t>
                 </w:r>
                 <w:r>
                   <w:rPr>
@@ -16481,7 +17298,6 @@
                 <w:dataBinding w:prefixMappings="xmlns:ns0='http://purl.org/dc/elements/1.1/' xmlns:ns1='http://schemas.openxmlformats.org/package/2006/metadata/core-properties' " w:xpath="/ns1:coreProperties[1]/ns0:creator[1]" w:storeItemID="{6C3C8BC8-F283-45AE-878A-BAB7291924A1}"/>
                 <w:text/>
               </w:sdtPr>
-              <w:sdtEndPr/>
               <w:sdtContent>
                 <w:tc>
                   <w:tcPr>
@@ -16640,7 +17456,7 @@
                   <w:rPr>
                     <w:lang w:val="fr-CH"/>
                   </w:rPr>
-                  <w:t>07.05.2026 13:43</w:t>
+                  <w:t>08.05.2026 07:48</w:t>
                 </w:r>
                 <w:r>
                   <w:rPr>
@@ -16733,7 +17549,6 @@
                 <w:dataBinding w:prefixMappings="xmlns:ns0='http://purl.org/dc/elements/1.1/' xmlns:ns1='http://schemas.openxmlformats.org/package/2006/metadata/core-properties' " w:xpath="/ns1:coreProperties[1]/ns0:creator[1]" w:storeItemID="{6C3C8BC8-F283-45AE-878A-BAB7291924A1}"/>
                 <w:text/>
               </w:sdtPr>
-              <w:sdtEndPr/>
               <w:sdtContent>
                 <w:tc>
                   <w:tcPr>
@@ -16892,7 +17707,7 @@
                   <w:rPr>
                     <w:lang w:val="fr-CH"/>
                   </w:rPr>
-                  <w:t>07.05.2026 13:43</w:t>
+                  <w:t>08.05.2026 07:48</w:t>
                 </w:r>
                 <w:r>
                   <w:rPr>

</xml_diff>